<commit_message>
Modulo de solicitudes implementado, modulo de Generales implemetados, proceder a implementar modulo de Comunicaciones
</commit_message>
<xml_diff>
--- a/docs/Mejoras y cambio/Mejoras y cambios.docx
+++ b/docs/Mejoras y cambio/Mejoras y cambios.docx
@@ -31,7 +31,13 @@
         <w:rPr>
           <w:lang w:val="es-MX"/>
         </w:rPr>
-        <w:t>1. Modifique el dato piso de la extencion por Betania y esta no aparece en la consulta del modulo publico:</w:t>
+        <w:t xml:space="preserve">1. </w:t>
+      </w:r>
+      <w:r>
+        <w:rPr>
+          <w:lang w:val="es-MX"/>
+        </w:rPr>
+        <w:t>Implementar la funcionalidad de Solicitudes:</w:t>
       </w:r>
     </w:p>
     <w:p>
@@ -45,10 +51,10 @@
           <w:lang w:val="es-MX"/>
         </w:rPr>
         <w:drawing>
-          <wp:inline distT="0" distB="0" distL="0" distR="0" wp14:anchorId="1342F1BF" wp14:editId="554878A2">
-            <wp:extent cx="5612130" cy="2785110"/>
+          <wp:inline distT="0" distB="0" distL="0" distR="0" wp14:anchorId="72C81862" wp14:editId="27AB8573">
+            <wp:extent cx="5612130" cy="2788285"/>
             <wp:effectExtent l="0" t="0" r="7620" b="0"/>
-            <wp:docPr id="162846676" name="Imagen 1"/>
+            <wp:docPr id="85812630" name="Imagen 1"/>
             <wp:cNvGraphicFramePr>
               <a:graphicFrameLocks xmlns:a="http://schemas.openxmlformats.org/drawingml/2006/main" noChangeAspect="1"/>
             </wp:cNvGraphicFramePr>
@@ -56,54 +62,7 @@
               <a:graphicData uri="http://schemas.openxmlformats.org/drawingml/2006/picture">
                 <pic:pic xmlns:pic="http://schemas.openxmlformats.org/drawingml/2006/picture">
                   <pic:nvPicPr>
-                    <pic:cNvPr id="162846676" name=""/>
-                    <pic:cNvPicPr/>
-                  </pic:nvPicPr>
-                  <pic:blipFill>
-                    <a:blip r:embed="rId4"/>
-                    <a:stretch>
-                      <a:fillRect/>
-                    </a:stretch>
-                  </pic:blipFill>
-                  <pic:spPr>
-                    <a:xfrm>
-                      <a:off x="0" y="0"/>
-                      <a:ext cx="5612130" cy="2785110"/>
-                    </a:xfrm>
-                    <a:prstGeom prst="rect">
-                      <a:avLst/>
-                    </a:prstGeom>
-                  </pic:spPr>
-                </pic:pic>
-              </a:graphicData>
-            </a:graphic>
-          </wp:inline>
-        </w:drawing>
-      </w:r>
-    </w:p>
-    <w:p>
-      <w:pPr>
-        <w:rPr>
-          <w:lang w:val="es-MX"/>
-        </w:rPr>
-      </w:pPr>
-      <w:r>
-        <w:rPr>
-          <w:lang w:val="es-MX"/>
-        </w:rPr>
-        <w:drawing>
-          <wp:inline distT="0" distB="0" distL="0" distR="0" wp14:anchorId="484033DD" wp14:editId="202949DB">
-            <wp:extent cx="5612130" cy="2783840"/>
-            <wp:effectExtent l="0" t="0" r="7620" b="0"/>
-            <wp:docPr id="2044690108" name="Imagen 1"/>
-            <wp:cNvGraphicFramePr>
-              <a:graphicFrameLocks xmlns:a="http://schemas.openxmlformats.org/drawingml/2006/main" noChangeAspect="1"/>
-            </wp:cNvGraphicFramePr>
-            <a:graphic xmlns:a="http://schemas.openxmlformats.org/drawingml/2006/main">
-              <a:graphicData uri="http://schemas.openxmlformats.org/drawingml/2006/picture">
-                <pic:pic xmlns:pic="http://schemas.openxmlformats.org/drawingml/2006/picture">
-                  <pic:nvPicPr>
-                    <pic:cNvPr id="2044690108" name=""/>
+                    <pic:cNvPr id="85812630" name=""/>
                     <pic:cNvPicPr/>
                   </pic:nvPicPr>
                   <pic:blipFill>
@@ -115,7 +74,7 @@
                   <pic:spPr>
                     <a:xfrm>
                       <a:off x="0" y="0"/>
-                      <a:ext cx="5612130" cy="2783840"/>
+                      <a:ext cx="5612130" cy="2788285"/>
                     </a:xfrm>
                     <a:prstGeom prst="rect">
                       <a:avLst/>
@@ -138,25 +97,236 @@
         <w:rPr>
           <w:lang w:val="es-MX"/>
         </w:rPr>
-        <w:t>2. el filtro en el panel administrador, colocalo parecido al panel publico, que lo pueda consultar por una lista desplegable, además cambie el cargo de sistemas por Asistente de ingeniera y ese se restablece a cargo, además en el JSON aparece como position y no como cargo.necesito que hagas la edición correspondiente.</w:t>
-      </w:r>
-    </w:p>
-    <w:p>
-      <w:pPr>
-        <w:rPr>
-          <w:lang w:val="es-MX"/>
-        </w:rPr>
-      </w:pPr>
-      <w:r>
-        <w:rPr>
-          <w:lang w:val="es-MX"/>
-        </w:rPr>
-        <w:lastRenderedPageBreak/>
+        <w:t>En el panel de inicio de sección, debajo del botón INGRESAR, colocar texto que diga “Solicitar Acceso” genere un modal que muestre los siguientes datos:</w:t>
+      </w:r>
+    </w:p>
+    <w:p>
+      <w:pPr>
+        <w:pStyle w:val="Prrafodelista"/>
+        <w:numPr>
+          <w:ilvl w:val="0"/>
+          <w:numId w:val="1"/>
+        </w:numPr>
+        <w:rPr>
+          <w:lang w:val="es-MX"/>
+        </w:rPr>
+      </w:pPr>
+      <w:r>
+        <w:rPr>
+          <w:lang w:val="es-MX"/>
+        </w:rPr>
+        <w:t>Primer Nombre (Obligatorio)</w:t>
+      </w:r>
+    </w:p>
+    <w:p>
+      <w:pPr>
+        <w:pStyle w:val="Prrafodelista"/>
+        <w:numPr>
+          <w:ilvl w:val="0"/>
+          <w:numId w:val="1"/>
+        </w:numPr>
+        <w:rPr>
+          <w:lang w:val="es-MX"/>
+        </w:rPr>
+      </w:pPr>
+      <w:r>
+        <w:rPr>
+          <w:lang w:val="es-MX"/>
+        </w:rPr>
+        <w:t>Segundo Nombre (Opcional)</w:t>
+      </w:r>
+    </w:p>
+    <w:p>
+      <w:pPr>
+        <w:pStyle w:val="Prrafodelista"/>
+        <w:numPr>
+          <w:ilvl w:val="0"/>
+          <w:numId w:val="1"/>
+        </w:numPr>
+        <w:rPr>
+          <w:lang w:val="es-MX"/>
+        </w:rPr>
+      </w:pPr>
+      <w:r>
+        <w:rPr>
+          <w:lang w:val="es-MX"/>
+        </w:rPr>
+        <w:t>Primer Apellido</w:t>
+      </w:r>
+      <w:r>
+        <w:rPr>
+          <w:lang w:val="es-MX"/>
+        </w:rPr>
+        <w:t xml:space="preserve"> (Obligatorio)</w:t>
+      </w:r>
+    </w:p>
+    <w:p>
+      <w:pPr>
+        <w:pStyle w:val="Prrafodelista"/>
+        <w:numPr>
+          <w:ilvl w:val="0"/>
+          <w:numId w:val="1"/>
+        </w:numPr>
+        <w:rPr>
+          <w:lang w:val="es-MX"/>
+        </w:rPr>
+      </w:pPr>
+      <w:r>
+        <w:rPr>
+          <w:lang w:val="es-MX"/>
+        </w:rPr>
+        <w:t>Segundo apellido</w:t>
+      </w:r>
+      <w:r>
+        <w:rPr>
+          <w:lang w:val="es-MX"/>
+        </w:rPr>
+        <w:t xml:space="preserve"> (Obligatorio)</w:t>
+      </w:r>
+    </w:p>
+    <w:p>
+      <w:pPr>
+        <w:pStyle w:val="Prrafodelista"/>
+        <w:numPr>
+          <w:ilvl w:val="0"/>
+          <w:numId w:val="1"/>
+        </w:numPr>
+        <w:rPr>
+          <w:lang w:val="es-MX"/>
+        </w:rPr>
+      </w:pPr>
+      <w:r>
+        <w:rPr>
+          <w:lang w:val="es-MX"/>
+        </w:rPr>
+        <w:t>Numero de Identificación</w:t>
+      </w:r>
+      <w:r>
+        <w:rPr>
+          <w:lang w:val="es-MX"/>
+        </w:rPr>
+        <w:t xml:space="preserve"> (Obligatorio)</w:t>
+      </w:r>
+    </w:p>
+    <w:p>
+      <w:pPr>
+        <w:pStyle w:val="Prrafodelista"/>
+        <w:numPr>
+          <w:ilvl w:val="0"/>
+          <w:numId w:val="1"/>
+        </w:numPr>
+        <w:rPr>
+          <w:lang w:val="es-MX"/>
+        </w:rPr>
+      </w:pPr>
+      <w:r>
+        <w:rPr>
+          <w:lang w:val="es-MX"/>
+        </w:rPr>
+        <w:t>Email Corporativo</w:t>
+      </w:r>
+      <w:r>
+        <w:rPr>
+          <w:lang w:val="es-MX"/>
+        </w:rPr>
+        <w:t xml:space="preserve"> (Obligatorio)</w:t>
+      </w:r>
+    </w:p>
+    <w:p>
+      <w:pPr>
+        <w:pStyle w:val="Prrafodelista"/>
+        <w:numPr>
+          <w:ilvl w:val="0"/>
+          <w:numId w:val="1"/>
+        </w:numPr>
+        <w:rPr>
+          <w:lang w:val="es-MX"/>
+        </w:rPr>
+      </w:pPr>
+      <w:r>
+        <w:rPr>
+          <w:lang w:val="es-MX"/>
+        </w:rPr>
+        <w:t>Numero de Celular</w:t>
+      </w:r>
+      <w:r>
+        <w:rPr>
+          <w:lang w:val="es-MX"/>
+        </w:rPr>
+        <w:t xml:space="preserve"> (Obligatorio)</w:t>
+      </w:r>
+    </w:p>
+    <w:p>
+      <w:pPr>
+        <w:pStyle w:val="Prrafodelista"/>
+        <w:numPr>
+          <w:ilvl w:val="0"/>
+          <w:numId w:val="1"/>
+        </w:numPr>
+        <w:rPr>
+          <w:lang w:val="es-MX"/>
+        </w:rPr>
+      </w:pPr>
+      <w:r>
+        <w:rPr>
+          <w:lang w:val="es-MX"/>
+        </w:rPr>
+        <w:t>Cargo del Usuario</w:t>
+      </w:r>
+      <w:r>
+        <w:rPr>
+          <w:lang w:val="es-MX"/>
+        </w:rPr>
+        <w:t xml:space="preserve"> (Obligatorio)</w:t>
+      </w:r>
+    </w:p>
+    <w:p>
+      <w:pPr>
+        <w:pStyle w:val="Prrafodelista"/>
+        <w:numPr>
+          <w:ilvl w:val="0"/>
+          <w:numId w:val="1"/>
+        </w:numPr>
+        <w:rPr>
+          <w:lang w:val="es-MX"/>
+        </w:rPr>
+      </w:pPr>
+      <w:r>
+        <w:rPr>
+          <w:lang w:val="es-MX"/>
+        </w:rPr>
+        <w:t>Fecha de Nacimiento</w:t>
+      </w:r>
+      <w:r>
+        <w:rPr>
+          <w:lang w:val="es-MX"/>
+        </w:rPr>
+        <w:t xml:space="preserve"> (Obligatorio)</w:t>
+      </w:r>
+    </w:p>
+    <w:p>
+      <w:pPr>
+        <w:rPr>
+          <w:lang w:val="es-MX"/>
+        </w:rPr>
+      </w:pPr>
+      <w:r>
+        <w:rPr>
+          <w:lang w:val="es-MX"/>
+        </w:rPr>
         <w:drawing>
-          <wp:inline distT="0" distB="0" distL="0" distR="0" wp14:anchorId="10D33EF6" wp14:editId="742FB962">
-            <wp:extent cx="5612130" cy="2791460"/>
-            <wp:effectExtent l="0" t="0" r="7620" b="8890"/>
-            <wp:docPr id="427508999" name="Imagen 1"/>
+          <wp:anchor distT="0" distB="0" distL="114300" distR="114300" simplePos="0" relativeHeight="251658240" behindDoc="0" locked="0" layoutInCell="1" allowOverlap="1" wp14:anchorId="44AF9F64" wp14:editId="35864839">
+            <wp:simplePos x="0" y="0"/>
+            <wp:positionH relativeFrom="margin">
+              <wp:align>center</wp:align>
+            </wp:positionH>
+            <wp:positionV relativeFrom="margin">
+              <wp:posOffset>6396902</wp:posOffset>
+            </wp:positionV>
+            <wp:extent cx="3178810" cy="2476500"/>
+            <wp:effectExtent l="0" t="0" r="2540" b="0"/>
+            <wp:wrapSquare wrapText="bothSides"/>
+            <wp:docPr id="1061385689" name="Imagen 1"/>
             <wp:cNvGraphicFramePr>
               <a:graphicFrameLocks xmlns:a="http://schemas.openxmlformats.org/drawingml/2006/main" noChangeAspect="1"/>
             </wp:cNvGraphicFramePr>
@@ -164,11 +334,17 @@
               <a:graphicData uri="http://schemas.openxmlformats.org/drawingml/2006/picture">
                 <pic:pic xmlns:pic="http://schemas.openxmlformats.org/drawingml/2006/picture">
                   <pic:nvPicPr>
-                    <pic:cNvPr id="427508999" name=""/>
+                    <pic:cNvPr id="1061385689" name=""/>
                     <pic:cNvPicPr/>
                   </pic:nvPicPr>
                   <pic:blipFill>
-                    <a:blip r:embed="rId6"/>
+                    <a:blip r:embed="rId6" cstate="print">
+                      <a:extLst>
+                        <a:ext uri="{28A0092B-C50C-407E-A947-70E740481C1C}">
+                          <a14:useLocalDpi xmlns:a14="http://schemas.microsoft.com/office/drawing/2010/main" val="0"/>
+                        </a:ext>
+                      </a:extLst>
+                    </a:blip>
                     <a:stretch>
                       <a:fillRect/>
                     </a:stretch>
@@ -176,7 +352,7 @@
                   <pic:spPr>
                     <a:xfrm>
                       <a:off x="0" y="0"/>
-                      <a:ext cx="5612130" cy="2791460"/>
+                      <a:ext cx="3178810" cy="2476500"/>
                     </a:xfrm>
                     <a:prstGeom prst="rect">
                       <a:avLst/>
@@ -185,38 +361,64 @@
                 </pic:pic>
               </a:graphicData>
             </a:graphic>
-          </wp:inline>
+            <wp14:sizeRelH relativeFrom="margin">
+              <wp14:pctWidth>0</wp14:pctWidth>
+            </wp14:sizeRelH>
+            <wp14:sizeRelV relativeFrom="margin">
+              <wp14:pctHeight>0</wp14:pctHeight>
+            </wp14:sizeRelV>
+          </wp:anchor>
         </w:drawing>
       </w:r>
-    </w:p>
-    <w:p>
-      <w:pPr>
-        <w:rPr>
-          <w:lang w:val="es-MX"/>
-        </w:rPr>
-      </w:pPr>
-      <w:r>
-        <w:rPr>
-          <w:lang w:val="es-MX"/>
-        </w:rPr>
-        <w:t>Cambia el estilo de consulta de correo de JSON por el mismo estilo que tiene el de consultar usuario, que aparezcan solo nombre completo, cargo, email, área, el floor no es necesario.</w:t>
-      </w:r>
-    </w:p>
-    <w:p>
-      <w:pPr>
-        <w:rPr>
-          <w:lang w:val="es-MX"/>
-        </w:rPr>
-      </w:pPr>
-      <w:r>
-        <w:rPr>
-          <w:lang w:val="es-MX"/>
+      <w:r>
+        <w:rPr>
+          <w:lang w:val="es-MX"/>
+        </w:rPr>
+        <w:t>Este debe tener el mismo estilo del modal de creación de usuario.</w:t>
+      </w:r>
+    </w:p>
+    <w:p>
+      <w:pPr>
+        <w:rPr>
+          <w:lang w:val="es-MX"/>
+        </w:rPr>
+      </w:pPr>
+      <w:r>
+        <w:rPr>
+          <w:lang w:val="es-MX"/>
+        </w:rPr>
+        <w:br w:type="page"/>
+      </w:r>
+    </w:p>
+    <w:p>
+      <w:pPr>
+        <w:rPr>
+          <w:lang w:val="es-MX"/>
+        </w:rPr>
+      </w:pPr>
+      <w:r>
+        <w:rPr>
+          <w:lang w:val="es-MX"/>
+        </w:rPr>
+        <w:lastRenderedPageBreak/>
+        <w:t>Una vez el usuario de clic en el botón que diga “Solicitar acceso” este debe llegar a modulo de solicitudes del panel administrativo</w:t>
+      </w:r>
+    </w:p>
+    <w:p>
+      <w:pPr>
+        <w:rPr>
+          <w:lang w:val="es-MX"/>
+        </w:rPr>
+      </w:pPr>
+      <w:r>
+        <w:rPr>
+          <w:noProof/>
         </w:rPr>
         <w:drawing>
-          <wp:inline distT="0" distB="0" distL="0" distR="0" wp14:anchorId="34AE86B7" wp14:editId="2672FD17">
-            <wp:extent cx="4867954" cy="3581900"/>
-            <wp:effectExtent l="0" t="0" r="0" b="0"/>
-            <wp:docPr id="1098352915" name="Imagen 1"/>
+          <wp:inline distT="0" distB="0" distL="0" distR="0" wp14:anchorId="39312FEF" wp14:editId="6278D39B">
+            <wp:extent cx="5612130" cy="2788285"/>
+            <wp:effectExtent l="0" t="0" r="7620" b="0"/>
+            <wp:docPr id="1688600508" name="Imagen 1"/>
             <wp:cNvGraphicFramePr>
               <a:graphicFrameLocks xmlns:a="http://schemas.openxmlformats.org/drawingml/2006/main" noChangeAspect="1"/>
             </wp:cNvGraphicFramePr>
@@ -224,7 +426,7 @@
               <a:graphicData uri="http://schemas.openxmlformats.org/drawingml/2006/picture">
                 <pic:pic xmlns:pic="http://schemas.openxmlformats.org/drawingml/2006/picture">
                   <pic:nvPicPr>
-                    <pic:cNvPr id="1098352915" name=""/>
+                    <pic:cNvPr id="1688600508" name=""/>
                     <pic:cNvPicPr/>
                   </pic:nvPicPr>
                   <pic:blipFill>
@@ -236,7 +438,7 @@
                   <pic:spPr>
                     <a:xfrm>
                       <a:off x="0" y="0"/>
-                      <a:ext cx="4867954" cy="3581900"/>
+                      <a:ext cx="5612130" cy="2788285"/>
                     </a:xfrm>
                     <a:prstGeom prst="rect">
                       <a:avLst/>
@@ -259,11 +461,238 @@
         <w:rPr>
           <w:lang w:val="es-MX"/>
         </w:rPr>
-        <w:t>El estilo de la consulta de extensiones lo mismo colocale el mismo estilo de la creación de usuarios y que los únicos datos que muestre sean, nombre de la extencion, numero de extencion, piso, área, tipo, estado (activo/inactivo)</w:t>
-      </w:r>
-    </w:p>
-    <w:p>
-      <w:pPr>
+        <w:t>En la tabla de solicitudes de usuarios debe aparecer lo siguiente:</w:t>
+      </w:r>
+    </w:p>
+    <w:p>
+      <w:pPr>
+        <w:pStyle w:val="Prrafodelista"/>
+        <w:numPr>
+          <w:ilvl w:val="0"/>
+          <w:numId w:val="2"/>
+        </w:numPr>
+        <w:rPr>
+          <w:lang w:val="es-MX"/>
+        </w:rPr>
+      </w:pPr>
+      <w:r>
+        <w:rPr>
+          <w:lang w:val="es-MX"/>
+        </w:rPr>
+        <w:t>Identificacion</w:t>
+      </w:r>
+    </w:p>
+    <w:p>
+      <w:pPr>
+        <w:pStyle w:val="Prrafodelista"/>
+        <w:numPr>
+          <w:ilvl w:val="0"/>
+          <w:numId w:val="2"/>
+        </w:numPr>
+        <w:rPr>
+          <w:lang w:val="es-MX"/>
+        </w:rPr>
+      </w:pPr>
+      <w:r>
+        <w:rPr>
+          <w:lang w:val="es-MX"/>
+        </w:rPr>
+        <w:t>Nombre completo (debe aparecer en línea primer nombre + segundo nombre + primer apellido + segundo apellido)</w:t>
+      </w:r>
+    </w:p>
+    <w:p>
+      <w:pPr>
+        <w:pStyle w:val="Prrafodelista"/>
+        <w:numPr>
+          <w:ilvl w:val="0"/>
+          <w:numId w:val="2"/>
+        </w:numPr>
+        <w:rPr>
+          <w:lang w:val="es-MX"/>
+        </w:rPr>
+      </w:pPr>
+      <w:r>
+        <w:rPr>
+          <w:lang w:val="es-MX"/>
+        </w:rPr>
+        <w:t>Cargo</w:t>
+      </w:r>
+    </w:p>
+    <w:p>
+      <w:pPr>
+        <w:pStyle w:val="Prrafodelista"/>
+        <w:numPr>
+          <w:ilvl w:val="0"/>
+          <w:numId w:val="2"/>
+        </w:numPr>
+        <w:rPr>
+          <w:lang w:val="es-MX"/>
+        </w:rPr>
+      </w:pPr>
+      <w:r>
+        <w:rPr>
+          <w:lang w:val="es-MX"/>
+        </w:rPr>
+        <w:t>Email Corporativo</w:t>
+      </w:r>
+    </w:p>
+    <w:p>
+      <w:pPr>
+        <w:pStyle w:val="Prrafodelista"/>
+        <w:numPr>
+          <w:ilvl w:val="0"/>
+          <w:numId w:val="2"/>
+        </w:numPr>
+        <w:rPr>
+          <w:lang w:val="es-MX"/>
+        </w:rPr>
+      </w:pPr>
+      <w:r>
+        <w:rPr>
+          <w:lang w:val="es-MX"/>
+        </w:rPr>
+        <w:t>Estado (Solicitud, Aprobado, Rechazado)</w:t>
+      </w:r>
+    </w:p>
+    <w:p>
+      <w:pPr>
+        <w:pStyle w:val="Prrafodelista"/>
+        <w:numPr>
+          <w:ilvl w:val="0"/>
+          <w:numId w:val="2"/>
+        </w:numPr>
+        <w:rPr>
+          <w:lang w:val="es-MX"/>
+        </w:rPr>
+      </w:pPr>
+      <w:r>
+        <w:rPr>
+          <w:lang w:val="es-MX"/>
+        </w:rPr>
+        <w:t>Acciones</w:t>
+      </w:r>
+    </w:p>
+    <w:p>
+      <w:pPr>
+        <w:pStyle w:val="Prrafodelista"/>
+        <w:numPr>
+          <w:ilvl w:val="1"/>
+          <w:numId w:val="2"/>
+        </w:numPr>
+        <w:rPr>
+          <w:lang w:val="es-MX"/>
+        </w:rPr>
+      </w:pPr>
+      <w:r>
+        <w:rPr>
+          <w:lang w:val="es-MX"/>
+        </w:rPr>
+        <w:t>Consultar: aquí con esto botón de deben de consultar todos los datos que el usuario registro</w:t>
+      </w:r>
+    </w:p>
+    <w:p>
+      <w:pPr>
+        <w:pStyle w:val="Prrafodelista"/>
+        <w:numPr>
+          <w:ilvl w:val="1"/>
+          <w:numId w:val="2"/>
+        </w:numPr>
+        <w:rPr>
+          <w:lang w:val="es-MX"/>
+        </w:rPr>
+      </w:pPr>
+      <w:r>
+        <w:rPr>
+          <w:lang w:val="es-MX"/>
+        </w:rPr>
+        <w:t>Aprobar: debe cargar un modal como el de registro de usuario pero agregar los siguientes nuevos campos</w:t>
+      </w:r>
+    </w:p>
+    <w:p>
+      <w:pPr>
+        <w:pStyle w:val="Prrafodelista"/>
+        <w:numPr>
+          <w:ilvl w:val="2"/>
+          <w:numId w:val="2"/>
+        </w:numPr>
+        <w:rPr>
+          <w:lang w:val="es-MX"/>
+        </w:rPr>
+      </w:pPr>
+      <w:r>
+        <w:rPr>
+          <w:lang w:val="es-MX"/>
+        </w:rPr>
+        <w:t xml:space="preserve">Nombre de Usuario (primero nombre + . + Primero apellido) este lo debe cargar automática </w:t>
+      </w:r>
+      <w:r>
+        <w:rPr>
+          <w:lang w:val="es-MX"/>
+        </w:rPr>
+        <w:t>de los datos que registro el usuario, debe permitir modificar</w:t>
+      </w:r>
+    </w:p>
+    <w:p>
+      <w:pPr>
+        <w:pStyle w:val="Prrafodelista"/>
+        <w:numPr>
+          <w:ilvl w:val="2"/>
+          <w:numId w:val="2"/>
+        </w:numPr>
+        <w:rPr>
+          <w:lang w:val="es-MX"/>
+        </w:rPr>
+      </w:pPr>
+      <w:r>
+        <w:rPr>
+          <w:lang w:val="es-MX"/>
+        </w:rPr>
+        <w:t>Contraseña</w:t>
+      </w:r>
+    </w:p>
+    <w:p>
+      <w:pPr>
+        <w:pStyle w:val="Prrafodelista"/>
+        <w:numPr>
+          <w:ilvl w:val="2"/>
+          <w:numId w:val="2"/>
+        </w:numPr>
+        <w:rPr>
+          <w:lang w:val="es-MX"/>
+        </w:rPr>
+      </w:pPr>
+      <w:r>
+        <w:rPr>
+          <w:lang w:val="es-MX"/>
+        </w:rPr>
+        <w:t>Cargo para permisos</w:t>
+      </w:r>
+    </w:p>
+    <w:p>
+      <w:pPr>
+        <w:pStyle w:val="Prrafodelista"/>
+        <w:numPr>
+          <w:ilvl w:val="2"/>
+          <w:numId w:val="2"/>
+        </w:numPr>
+        <w:rPr>
+          <w:lang w:val="es-MX"/>
+        </w:rPr>
+      </w:pPr>
+      <w:r>
+        <w:rPr>
+          <w:lang w:val="es-MX"/>
+        </w:rPr>
+        <w:t>En vez de aparecer los 4 campos de primer nombre, segundo nombre, primer apellido, segundo apellido, establecer un solo campo que se llame “Nombre completo” que muestre primer nombre + segundo nombre + primer apellido + segundo apellido</w:t>
+      </w:r>
+    </w:p>
+    <w:p>
+      <w:pPr>
+        <w:pStyle w:val="Prrafodelista"/>
+        <w:numPr>
+          <w:ilvl w:val="1"/>
+          <w:numId w:val="2"/>
+        </w:numPr>
         <w:rPr>
           <w:lang w:val="es-MX"/>
         </w:rPr>
@@ -273,11 +702,50 @@
           <w:lang w:val="es-MX"/>
         </w:rPr>
         <w:lastRenderedPageBreak/>
+        <w:t>Rechazar: si rechazo el usuario este queda rechazo, pero puede aprobarse luego.</w:t>
+      </w:r>
+    </w:p>
+    <w:p>
+      <w:pPr>
+        <w:rPr>
+          <w:lang w:val="es-MX"/>
+        </w:rPr>
+      </w:pPr>
+      <w:r>
+        <w:rPr>
+          <w:lang w:val="es-MX"/>
+        </w:rPr>
+        <w:t>En caso tal se realice una solicitud este debe validar contra el usuario el numero de identificación, si el numero de identificación del usuario solicitante se encuentra en los registros de numero de identificación del usuario, debe informar “usuario ya se encuentra creado en el sistema”.</w:t>
+      </w:r>
+    </w:p>
+    <w:p>
+      <w:pPr>
+        <w:rPr>
+          <w:noProof/>
+          <w:lang w:val="es-MX"/>
+        </w:rPr>
+      </w:pPr>
+      <w:r>
+        <w:rPr>
+          <w:lang w:val="es-MX"/>
+        </w:rPr>
+        <w:t>2. En el modulo de gestión de usuario:</w:t>
+      </w:r>
+      <w:r>
+        <w:rPr>
+          <w:noProof/>
+        </w:rPr>
+        <w:t xml:space="preserve"> </w:t>
+      </w:r>
+      <w:r>
+        <w:rPr>
+          <w:lang w:val="es-MX"/>
+        </w:rPr>
         <w:drawing>
-          <wp:inline distT="0" distB="0" distL="0" distR="0" wp14:anchorId="1ECB3CDA" wp14:editId="75EA3156">
-            <wp:extent cx="4896533" cy="3877216"/>
-            <wp:effectExtent l="0" t="0" r="0" b="9525"/>
-            <wp:docPr id="409222054" name="Imagen 1"/>
+          <wp:inline distT="0" distB="0" distL="0" distR="0" wp14:anchorId="5549FD76" wp14:editId="2D7D717D">
+            <wp:extent cx="5612130" cy="1127760"/>
+            <wp:effectExtent l="0" t="0" r="7620" b="0"/>
+            <wp:docPr id="362744487" name="Imagen 1"/>
             <wp:cNvGraphicFramePr>
               <a:graphicFrameLocks xmlns:a="http://schemas.openxmlformats.org/drawingml/2006/main" noChangeAspect="1"/>
             </wp:cNvGraphicFramePr>
@@ -285,7 +753,7 @@
               <a:graphicData uri="http://schemas.openxmlformats.org/drawingml/2006/picture">
                 <pic:pic xmlns:pic="http://schemas.openxmlformats.org/drawingml/2006/picture">
                   <pic:nvPicPr>
-                    <pic:cNvPr id="409222054" name=""/>
+                    <pic:cNvPr id="362744487" name=""/>
                     <pic:cNvPicPr/>
                   </pic:nvPicPr>
                   <pic:blipFill>
@@ -297,7 +765,7 @@
                   <pic:spPr>
                     <a:xfrm>
                       <a:off x="0" y="0"/>
-                      <a:ext cx="4896533" cy="3877216"/>
+                      <a:ext cx="5612130" cy="1127760"/>
                     </a:xfrm>
                     <a:prstGeom prst="rect">
                       <a:avLst/>
@@ -313,14 +781,31 @@
     <w:p>
       <w:pPr>
         <w:rPr>
-          <w:lang w:val="es-MX"/>
-        </w:rPr>
-      </w:pPr>
-      <w:r>
-        <w:rPr>
-          <w:lang w:val="es-MX"/>
-        </w:rPr>
-        <w:t>Los mismo para la consulta de sitios de redireccion</w:t>
+          <w:noProof/>
+          <w:lang w:val="es-MX"/>
+        </w:rPr>
+      </w:pPr>
+      <w:r>
+        <w:rPr>
+          <w:noProof/>
+          <w:lang w:val="es-MX"/>
+        </w:rPr>
+        <w:t>Existe un boton con una llave que referencia al restablecimiento de contraseña, este al dar clic restablece la contraseña por el numero de documento, cambiaremos la logica, al dar clic debe solictar en un modal la contraseña a restablecer, donde el usuario ingrese la contraseña y se restablezca por esa.</w:t>
+      </w:r>
+    </w:p>
+    <w:p>
+      <w:pPr>
+        <w:rPr>
+          <w:noProof/>
+          <w:lang w:val="es-MX"/>
+        </w:rPr>
+      </w:pPr>
+      <w:r>
+        <w:rPr>
+          <w:noProof/>
+          <w:lang w:val="es-MX"/>
+        </w:rPr>
+        <w:t>Adicional a eso, quita esa ventana de infomacion y colocalo como una notifiacion en el cotado inferior derecho donde diga este mensaje.</w:t>
       </w:r>
     </w:p>
     <w:p>
@@ -334,10 +819,10 @@
           <w:lang w:val="es-MX"/>
         </w:rPr>
         <w:drawing>
-          <wp:inline distT="0" distB="0" distL="0" distR="0" wp14:anchorId="6F1433A8" wp14:editId="750EA638">
-            <wp:extent cx="4591691" cy="2362530"/>
-            <wp:effectExtent l="0" t="0" r="0" b="0"/>
-            <wp:docPr id="532555383" name="Imagen 1"/>
+          <wp:inline distT="0" distB="0" distL="0" distR="0" wp14:anchorId="62C1E65A" wp14:editId="32793AA1">
+            <wp:extent cx="5612130" cy="2926080"/>
+            <wp:effectExtent l="0" t="0" r="7620" b="7620"/>
+            <wp:docPr id="15623623" name="Imagen 1"/>
             <wp:cNvGraphicFramePr>
               <a:graphicFrameLocks xmlns:a="http://schemas.openxmlformats.org/drawingml/2006/main" noChangeAspect="1"/>
             </wp:cNvGraphicFramePr>
@@ -345,7 +830,7 @@
               <a:graphicData uri="http://schemas.openxmlformats.org/drawingml/2006/picture">
                 <pic:pic xmlns:pic="http://schemas.openxmlformats.org/drawingml/2006/picture">
                   <pic:nvPicPr>
-                    <pic:cNvPr id="532555383" name=""/>
+                    <pic:cNvPr id="15623623" name=""/>
                     <pic:cNvPicPr/>
                   </pic:nvPicPr>
                   <pic:blipFill>
@@ -357,7 +842,7 @@
                   <pic:spPr>
                     <a:xfrm>
                       <a:off x="0" y="0"/>
-                      <a:ext cx="4591691" cy="2362530"/>
+                      <a:ext cx="5612130" cy="2926080"/>
                     </a:xfrm>
                     <a:prstGeom prst="rect">
                       <a:avLst/>
@@ -370,133 +855,6 @@
         </w:drawing>
       </w:r>
     </w:p>
-    <w:p>
-      <w:pPr>
-        <w:rPr>
-          <w:lang w:val="es-MX"/>
-        </w:rPr>
-      </w:pPr>
-      <w:r>
-        <w:rPr>
-          <w:lang w:val="es-MX"/>
-        </w:rPr>
-        <w:t>El numero de contacto de los usuarios cuando lo registro y doy en grabrar o actualizar se elimina</w:t>
-      </w:r>
-    </w:p>
-    <w:p>
-      <w:pPr>
-        <w:rPr>
-          <w:lang w:val="es-MX"/>
-        </w:rPr>
-      </w:pPr>
-      <w:r>
-        <w:rPr>
-          <w:lang w:val="es-MX"/>
-        </w:rPr>
-        <w:lastRenderedPageBreak/>
-        <w:drawing>
-          <wp:inline distT="0" distB="0" distL="0" distR="0" wp14:anchorId="7330DB42" wp14:editId="60AFF82E">
-            <wp:extent cx="5612130" cy="4076700"/>
-            <wp:effectExtent l="0" t="0" r="7620" b="0"/>
-            <wp:docPr id="527086970" name="Imagen 1"/>
-            <wp:cNvGraphicFramePr>
-              <a:graphicFrameLocks xmlns:a="http://schemas.openxmlformats.org/drawingml/2006/main" noChangeAspect="1"/>
-            </wp:cNvGraphicFramePr>
-            <a:graphic xmlns:a="http://schemas.openxmlformats.org/drawingml/2006/main">
-              <a:graphicData uri="http://schemas.openxmlformats.org/drawingml/2006/picture">
-                <pic:pic xmlns:pic="http://schemas.openxmlformats.org/drawingml/2006/picture">
-                  <pic:nvPicPr>
-                    <pic:cNvPr id="527086970" name=""/>
-                    <pic:cNvPicPr/>
-                  </pic:nvPicPr>
-                  <pic:blipFill>
-                    <a:blip r:embed="rId10"/>
-                    <a:stretch>
-                      <a:fillRect/>
-                    </a:stretch>
-                  </pic:blipFill>
-                  <pic:spPr>
-                    <a:xfrm>
-                      <a:off x="0" y="0"/>
-                      <a:ext cx="5612130" cy="4076700"/>
-                    </a:xfrm>
-                    <a:prstGeom prst="rect">
-                      <a:avLst/>
-                    </a:prstGeom>
-                  </pic:spPr>
-                </pic:pic>
-              </a:graphicData>
-            </a:graphic>
-          </wp:inline>
-        </w:drawing>
-      </w:r>
-    </w:p>
-    <w:p>
-      <w:pPr>
-        <w:rPr>
-          <w:lang w:val="es-MX"/>
-        </w:rPr>
-      </w:pPr>
-      <w:r>
-        <w:rPr>
-          <w:lang w:val="es-MX"/>
-        </w:rPr>
-        <w:t>Colca en el registro de correo la opción “Es soporte” para que también se cargue en el modal del modulo de soporte</w:t>
-      </w:r>
-    </w:p>
-    <w:p>
-      <w:pPr>
-        <w:rPr>
-          <w:lang w:val="es-MX"/>
-        </w:rPr>
-      </w:pPr>
-      <w:r>
-        <w:rPr>
-          <w:lang w:val="es-MX"/>
-        </w:rPr>
-        <w:drawing>
-          <wp:inline distT="0" distB="0" distL="0" distR="0" wp14:anchorId="07575B33" wp14:editId="6FBFFE5E">
-            <wp:extent cx="5612130" cy="2197100"/>
-            <wp:effectExtent l="0" t="0" r="7620" b="0"/>
-            <wp:docPr id="1397558645" name="Imagen 1"/>
-            <wp:cNvGraphicFramePr>
-              <a:graphicFrameLocks xmlns:a="http://schemas.openxmlformats.org/drawingml/2006/main" noChangeAspect="1"/>
-            </wp:cNvGraphicFramePr>
-            <a:graphic xmlns:a="http://schemas.openxmlformats.org/drawingml/2006/main">
-              <a:graphicData uri="http://schemas.openxmlformats.org/drawingml/2006/picture">
-                <pic:pic xmlns:pic="http://schemas.openxmlformats.org/drawingml/2006/picture">
-                  <pic:nvPicPr>
-                    <pic:cNvPr id="1397558645" name=""/>
-                    <pic:cNvPicPr/>
-                  </pic:nvPicPr>
-                  <pic:blipFill>
-                    <a:blip r:embed="rId11"/>
-                    <a:stretch>
-                      <a:fillRect/>
-                    </a:stretch>
-                  </pic:blipFill>
-                  <pic:spPr>
-                    <a:xfrm>
-                      <a:off x="0" y="0"/>
-                      <a:ext cx="5612130" cy="2197100"/>
-                    </a:xfrm>
-                    <a:prstGeom prst="rect">
-                      <a:avLst/>
-                    </a:prstGeom>
-                  </pic:spPr>
-                </pic:pic>
-              </a:graphicData>
-            </a:graphic>
-          </wp:inline>
-        </w:drawing>
-      </w:r>
-      <w:r>
-        <w:rPr>
-          <w:lang w:val="es-MX"/>
-        </w:rPr>
-        <w:t xml:space="preserve"> </w:t>
-      </w:r>
-    </w:p>
     <w:sectPr>
       <w:pgSz w:w="12240" w:h="15840"/>
       <w:pgMar w:top="1417" w:right="1701" w:bottom="1417" w:left="1701" w:header="708" w:footer="708" w:gutter="0"/>
@@ -505,6 +863,243 @@
     </w:sectPr>
   </w:body>
 </w:document>
+</file>
+
+<file path=word/numbering.xml><?xml version="1.0" encoding="utf-8"?>
+<w:numbering xmlns:wpc="http://schemas.microsoft.com/office/word/2010/wordprocessingCanvas" xmlns:cx="http://schemas.microsoft.com/office/drawing/2014/chartex" xmlns:cx1="http://schemas.microsoft.com/office/drawing/2015/9/8/chartex" xmlns:cx2="http://schemas.microsoft.com/office/drawing/2015/10/21/chartex" xmlns:cx3="http://schemas.microsoft.com/office/drawing/2016/5/9/chartex" xmlns:cx4="http://schemas.microsoft.com/office/drawing/2016/5/10/chartex" xmlns:cx5="http://schemas.microsoft.com/office/drawing/2016/5/11/chartex" xmlns:cx6="http://schemas.microsoft.com/office/drawing/2016/5/12/chartex" xmlns:cx7="http://schemas.microsoft.com/office/drawing/2016/5/13/chartex" xmlns:cx8="http://schemas.microsoft.com/office/drawing/2016/5/14/chartex" xmlns:mc="http://schemas.openxmlformats.org/markup-compatibility/2006" xmlns:aink="http://schemas.microsoft.com/office/drawing/2016/ink" xmlns:am3d="http://schemas.microsoft.com/office/drawing/2017/model3d" xmlns:o="urn:schemas-microsoft-com:office:office" xmlns:oel="http://schemas.microsoft.com/office/2019/extlst" xmlns:r="http://schemas.openxmlformats.org/officeDocument/2006/relationships" xmlns:m="http://schemas.openxmlformats.org/officeDocument/2006/math" xmlns:v="urn:schemas-microsoft-com:vml" xmlns:wp14="http://schemas.microsoft.com/office/word/2010/wordprocessingDrawing" xmlns:wp="http://schemas.openxmlformats.org/drawingml/2006/wordprocessingDrawing" xmlns:w10="urn:schemas-microsoft-com:office:word" xmlns:w="http://schemas.openxmlformats.org/wordprocessingml/2006/main" xmlns:w14="http://schemas.microsoft.com/office/word/2010/wordml" xmlns:w15="http://schemas.microsoft.com/office/word/2012/wordml" xmlns:w16cex="http://schemas.microsoft.com/office/word/2018/wordml/cex" xmlns:w16cid="http://schemas.microsoft.com/office/word/2016/wordml/cid" xmlns:w16="http://schemas.microsoft.com/office/word/2018/wordml" xmlns:w16du="http://schemas.microsoft.com/office/word/2023/wordml/word16du" xmlns:w16sdtdh="http://schemas.microsoft.com/office/word/2020/wordml/sdtdatahash" xmlns:w16sdtfl="http://schemas.microsoft.com/office/word/2024/wordml/sdtformatlock" xmlns:w16se="http://schemas.microsoft.com/office/word/2015/wordml/symex" xmlns:wpg="http://schemas.microsoft.com/office/word/2010/wordprocessingGroup" xmlns:wpi="http://schemas.microsoft.com/office/word/2010/wordprocessingInk" xmlns:wne="http://schemas.microsoft.com/office/word/2006/wordml" xmlns:wps="http://schemas.microsoft.com/office/word/2010/wordprocessingShape" mc:Ignorable="w14 w15 w16se w16cid w16 w16cex w16sdtdh w16sdtfl w16du wp14">
+  <w:abstractNum w:abstractNumId="0" w15:restartNumberingAfterBreak="0">
+    <w:nsid w:val="07FC02F7"/>
+    <w:multiLevelType w:val="hybridMultilevel"/>
+    <w:tmpl w:val="20165240"/>
+    <w:lvl w:ilvl="0" w:tplc="DEE81658">
+      <w:start w:val="1"/>
+      <w:numFmt w:val="bullet"/>
+      <w:lvlText w:val=""/>
+      <w:lvlJc w:val="left"/>
+      <w:pPr>
+        <w:ind w:left="720" w:hanging="360"/>
+      </w:pPr>
+      <w:rPr>
+        <w:rFonts w:ascii="Symbol" w:eastAsiaTheme="minorHAnsi" w:hAnsi="Symbol" w:cstheme="minorBidi" w:hint="default"/>
+      </w:rPr>
+    </w:lvl>
+    <w:lvl w:ilvl="1" w:tplc="240A0003">
+      <w:start w:val="1"/>
+      <w:numFmt w:val="bullet"/>
+      <w:lvlText w:val="o"/>
+      <w:lvlJc w:val="left"/>
+      <w:pPr>
+        <w:ind w:left="1440" w:hanging="360"/>
+      </w:pPr>
+      <w:rPr>
+        <w:rFonts w:ascii="Courier New" w:hAnsi="Courier New" w:cs="Courier New" w:hint="default"/>
+      </w:rPr>
+    </w:lvl>
+    <w:lvl w:ilvl="2" w:tplc="240A0005">
+      <w:start w:val="1"/>
+      <w:numFmt w:val="bullet"/>
+      <w:lvlText w:val=""/>
+      <w:lvlJc w:val="left"/>
+      <w:pPr>
+        <w:ind w:left="2160" w:hanging="360"/>
+      </w:pPr>
+      <w:rPr>
+        <w:rFonts w:ascii="Wingdings" w:hAnsi="Wingdings" w:hint="default"/>
+      </w:rPr>
+    </w:lvl>
+    <w:lvl w:ilvl="3" w:tplc="240A0001">
+      <w:start w:val="1"/>
+      <w:numFmt w:val="bullet"/>
+      <w:lvlText w:val=""/>
+      <w:lvlJc w:val="left"/>
+      <w:pPr>
+        <w:ind w:left="2880" w:hanging="360"/>
+      </w:pPr>
+      <w:rPr>
+        <w:rFonts w:ascii="Symbol" w:hAnsi="Symbol" w:hint="default"/>
+      </w:rPr>
+    </w:lvl>
+    <w:lvl w:ilvl="4" w:tplc="240A0003" w:tentative="1">
+      <w:start w:val="1"/>
+      <w:numFmt w:val="bullet"/>
+      <w:lvlText w:val="o"/>
+      <w:lvlJc w:val="left"/>
+      <w:pPr>
+        <w:ind w:left="3600" w:hanging="360"/>
+      </w:pPr>
+      <w:rPr>
+        <w:rFonts w:ascii="Courier New" w:hAnsi="Courier New" w:cs="Courier New" w:hint="default"/>
+      </w:rPr>
+    </w:lvl>
+    <w:lvl w:ilvl="5" w:tplc="240A0005" w:tentative="1">
+      <w:start w:val="1"/>
+      <w:numFmt w:val="bullet"/>
+      <w:lvlText w:val=""/>
+      <w:lvlJc w:val="left"/>
+      <w:pPr>
+        <w:ind w:left="4320" w:hanging="360"/>
+      </w:pPr>
+      <w:rPr>
+        <w:rFonts w:ascii="Wingdings" w:hAnsi="Wingdings" w:hint="default"/>
+      </w:rPr>
+    </w:lvl>
+    <w:lvl w:ilvl="6" w:tplc="240A0001" w:tentative="1">
+      <w:start w:val="1"/>
+      <w:numFmt w:val="bullet"/>
+      <w:lvlText w:val=""/>
+      <w:lvlJc w:val="left"/>
+      <w:pPr>
+        <w:ind w:left="5040" w:hanging="360"/>
+      </w:pPr>
+      <w:rPr>
+        <w:rFonts w:ascii="Symbol" w:hAnsi="Symbol" w:hint="default"/>
+      </w:rPr>
+    </w:lvl>
+    <w:lvl w:ilvl="7" w:tplc="240A0003" w:tentative="1">
+      <w:start w:val="1"/>
+      <w:numFmt w:val="bullet"/>
+      <w:lvlText w:val="o"/>
+      <w:lvlJc w:val="left"/>
+      <w:pPr>
+        <w:ind w:left="5760" w:hanging="360"/>
+      </w:pPr>
+      <w:rPr>
+        <w:rFonts w:ascii="Courier New" w:hAnsi="Courier New" w:cs="Courier New" w:hint="default"/>
+      </w:rPr>
+    </w:lvl>
+    <w:lvl w:ilvl="8" w:tplc="240A0005" w:tentative="1">
+      <w:start w:val="1"/>
+      <w:numFmt w:val="bullet"/>
+      <w:lvlText w:val=""/>
+      <w:lvlJc w:val="left"/>
+      <w:pPr>
+        <w:ind w:left="6480" w:hanging="360"/>
+      </w:pPr>
+      <w:rPr>
+        <w:rFonts w:ascii="Wingdings" w:hAnsi="Wingdings" w:hint="default"/>
+      </w:rPr>
+    </w:lvl>
+  </w:abstractNum>
+  <w:abstractNum w:abstractNumId="1" w15:restartNumberingAfterBreak="0">
+    <w:nsid w:val="2C334FEE"/>
+    <w:multiLevelType w:val="hybridMultilevel"/>
+    <w:tmpl w:val="B27017C0"/>
+    <w:lvl w:ilvl="0" w:tplc="3FCA89AA">
+      <w:start w:val="1"/>
+      <w:numFmt w:val="bullet"/>
+      <w:lvlText w:val="-"/>
+      <w:lvlJc w:val="left"/>
+      <w:pPr>
+        <w:ind w:left="720" w:hanging="360"/>
+      </w:pPr>
+      <w:rPr>
+        <w:rFonts w:ascii="Aptos" w:eastAsiaTheme="minorHAnsi" w:hAnsi="Aptos" w:cstheme="minorBidi" w:hint="default"/>
+      </w:rPr>
+    </w:lvl>
+    <w:lvl w:ilvl="1" w:tplc="240A0003" w:tentative="1">
+      <w:start w:val="1"/>
+      <w:numFmt w:val="bullet"/>
+      <w:lvlText w:val="o"/>
+      <w:lvlJc w:val="left"/>
+      <w:pPr>
+        <w:ind w:left="1440" w:hanging="360"/>
+      </w:pPr>
+      <w:rPr>
+        <w:rFonts w:ascii="Courier New" w:hAnsi="Courier New" w:cs="Courier New" w:hint="default"/>
+      </w:rPr>
+    </w:lvl>
+    <w:lvl w:ilvl="2" w:tplc="240A0005" w:tentative="1">
+      <w:start w:val="1"/>
+      <w:numFmt w:val="bullet"/>
+      <w:lvlText w:val=""/>
+      <w:lvlJc w:val="left"/>
+      <w:pPr>
+        <w:ind w:left="2160" w:hanging="360"/>
+      </w:pPr>
+      <w:rPr>
+        <w:rFonts w:ascii="Wingdings" w:hAnsi="Wingdings" w:hint="default"/>
+      </w:rPr>
+    </w:lvl>
+    <w:lvl w:ilvl="3" w:tplc="240A0001" w:tentative="1">
+      <w:start w:val="1"/>
+      <w:numFmt w:val="bullet"/>
+      <w:lvlText w:val=""/>
+      <w:lvlJc w:val="left"/>
+      <w:pPr>
+        <w:ind w:left="2880" w:hanging="360"/>
+      </w:pPr>
+      <w:rPr>
+        <w:rFonts w:ascii="Symbol" w:hAnsi="Symbol" w:hint="default"/>
+      </w:rPr>
+    </w:lvl>
+    <w:lvl w:ilvl="4" w:tplc="240A0003" w:tentative="1">
+      <w:start w:val="1"/>
+      <w:numFmt w:val="bullet"/>
+      <w:lvlText w:val="o"/>
+      <w:lvlJc w:val="left"/>
+      <w:pPr>
+        <w:ind w:left="3600" w:hanging="360"/>
+      </w:pPr>
+      <w:rPr>
+        <w:rFonts w:ascii="Courier New" w:hAnsi="Courier New" w:cs="Courier New" w:hint="default"/>
+      </w:rPr>
+    </w:lvl>
+    <w:lvl w:ilvl="5" w:tplc="240A0005" w:tentative="1">
+      <w:start w:val="1"/>
+      <w:numFmt w:val="bullet"/>
+      <w:lvlText w:val=""/>
+      <w:lvlJc w:val="left"/>
+      <w:pPr>
+        <w:ind w:left="4320" w:hanging="360"/>
+      </w:pPr>
+      <w:rPr>
+        <w:rFonts w:ascii="Wingdings" w:hAnsi="Wingdings" w:hint="default"/>
+      </w:rPr>
+    </w:lvl>
+    <w:lvl w:ilvl="6" w:tplc="240A0001" w:tentative="1">
+      <w:start w:val="1"/>
+      <w:numFmt w:val="bullet"/>
+      <w:lvlText w:val=""/>
+      <w:lvlJc w:val="left"/>
+      <w:pPr>
+        <w:ind w:left="5040" w:hanging="360"/>
+      </w:pPr>
+      <w:rPr>
+        <w:rFonts w:ascii="Symbol" w:hAnsi="Symbol" w:hint="default"/>
+      </w:rPr>
+    </w:lvl>
+    <w:lvl w:ilvl="7" w:tplc="240A0003" w:tentative="1">
+      <w:start w:val="1"/>
+      <w:numFmt w:val="bullet"/>
+      <w:lvlText w:val="o"/>
+      <w:lvlJc w:val="left"/>
+      <w:pPr>
+        <w:ind w:left="5760" w:hanging="360"/>
+      </w:pPr>
+      <w:rPr>
+        <w:rFonts w:ascii="Courier New" w:hAnsi="Courier New" w:cs="Courier New" w:hint="default"/>
+      </w:rPr>
+    </w:lvl>
+    <w:lvl w:ilvl="8" w:tplc="240A0005" w:tentative="1">
+      <w:start w:val="1"/>
+      <w:numFmt w:val="bullet"/>
+      <w:lvlText w:val=""/>
+      <w:lvlJc w:val="left"/>
+      <w:pPr>
+        <w:ind w:left="6480" w:hanging="360"/>
+      </w:pPr>
+      <w:rPr>
+        <w:rFonts w:ascii="Wingdings" w:hAnsi="Wingdings" w:hint="default"/>
+      </w:rPr>
+    </w:lvl>
+  </w:abstractNum>
+  <w:num w:numId="1" w16cid:durableId="968819108">
+    <w:abstractNumId w:val="1"/>
+  </w:num>
+  <w:num w:numId="2" w16cid:durableId="260070218">
+    <w:abstractNumId w:val="0"/>
+  </w:num>
+</w:numbering>
 </file>
 
 <file path=word/styles.xml><?xml version="1.0" encoding="utf-8"?>

</xml_diff>

<commit_message>
Continuar con el desarrollo del modulo de comunicaciones
</commit_message>
<xml_diff>
--- a/docs/Mejoras y cambio/Mejoras y cambios.docx
+++ b/docs/Mejoras y cambio/Mejoras y cambios.docx
@@ -23,25 +23,47 @@
     </w:p>
     <w:p>
       <w:pPr>
-        <w:rPr>
-          <w:lang w:val="es-MX"/>
-        </w:rPr>
-      </w:pPr>
-      <w:r>
-        <w:rPr>
-          <w:lang w:val="es-MX"/>
-        </w:rPr>
-        <w:t xml:space="preserve">1. </w:t>
-      </w:r>
-      <w:r>
-        <w:rPr>
-          <w:lang w:val="es-MX"/>
-        </w:rPr>
-        <w:t>Implementar la funcionalidad de Solicitudes:</w:t>
+        <w:pStyle w:val="Prrafodelista"/>
+        <w:numPr>
+          <w:ilvl w:val="0"/>
+          <w:numId w:val="4"/>
+        </w:numPr>
+        <w:rPr>
+          <w:lang w:val="es-MX"/>
+        </w:rPr>
+      </w:pPr>
+      <w:r>
+        <w:rPr>
+          <w:lang w:val="es-MX"/>
+        </w:rPr>
+        <w:t>Vamos a implementar el módulo de Comunicaciones:</w:t>
       </w:r>
     </w:p>
     <w:p>
       <w:pPr>
+        <w:pStyle w:val="Prrafodelista"/>
+        <w:numPr>
+          <w:ilvl w:val="1"/>
+          <w:numId w:val="4"/>
+        </w:numPr>
+        <w:rPr>
+          <w:lang w:val="es-MX"/>
+        </w:rPr>
+      </w:pPr>
+      <w:r>
+        <w:rPr>
+          <w:lang w:val="es-MX"/>
+        </w:rPr>
+        <w:t>Carpera Usuarios:</w:t>
+      </w:r>
+    </w:p>
+    <w:p>
+      <w:pPr>
+        <w:pStyle w:val="Prrafodelista"/>
+        <w:numPr>
+          <w:ilvl w:val="2"/>
+          <w:numId w:val="4"/>
+        </w:numPr>
         <w:rPr>
           <w:lang w:val="es-MX"/>
         </w:rPr>
@@ -51,10 +73,18 @@
           <w:lang w:val="es-MX"/>
         </w:rPr>
         <w:drawing>
-          <wp:inline distT="0" distB="0" distL="0" distR="0" wp14:anchorId="72C81862" wp14:editId="27AB8573">
-            <wp:extent cx="5612130" cy="2788285"/>
-            <wp:effectExtent l="0" t="0" r="7620" b="0"/>
-            <wp:docPr id="85812630" name="Imagen 1"/>
+          <wp:anchor distT="0" distB="0" distL="114300" distR="114300" simplePos="0" relativeHeight="251658240" behindDoc="0" locked="0" layoutInCell="1" allowOverlap="1" wp14:anchorId="46A56521" wp14:editId="60AEBDA7">
+            <wp:simplePos x="0" y="0"/>
+            <wp:positionH relativeFrom="margin">
+              <wp:posOffset>-659130</wp:posOffset>
+            </wp:positionH>
+            <wp:positionV relativeFrom="margin">
+              <wp:posOffset>1016000</wp:posOffset>
+            </wp:positionV>
+            <wp:extent cx="1885950" cy="4451350"/>
+            <wp:effectExtent l="0" t="0" r="0" b="6350"/>
+            <wp:wrapSquare wrapText="bothSides"/>
+            <wp:docPr id="1208824913" name="Imagen 1"/>
             <wp:cNvGraphicFramePr>
               <a:graphicFrameLocks xmlns:a="http://schemas.openxmlformats.org/drawingml/2006/main" noChangeAspect="1"/>
             </wp:cNvGraphicFramePr>
@@ -62,11 +92,542 @@
               <a:graphicData uri="http://schemas.openxmlformats.org/drawingml/2006/picture">
                 <pic:pic xmlns:pic="http://schemas.openxmlformats.org/drawingml/2006/picture">
                   <pic:nvPicPr>
-                    <pic:cNvPr id="85812630" name=""/>
+                    <pic:cNvPr id="1208824913" name=""/>
                     <pic:cNvPicPr/>
                   </pic:nvPicPr>
                   <pic:blipFill>
-                    <a:blip r:embed="rId5"/>
+                    <a:blip r:embed="rId6">
+                      <a:extLst>
+                        <a:ext uri="{28A0092B-C50C-407E-A947-70E740481C1C}">
+                          <a14:useLocalDpi xmlns:a14="http://schemas.microsoft.com/office/drawing/2010/main" val="0"/>
+                        </a:ext>
+                      </a:extLst>
+                    </a:blip>
+                    <a:stretch>
+                      <a:fillRect/>
+                    </a:stretch>
+                  </pic:blipFill>
+                  <pic:spPr>
+                    <a:xfrm>
+                      <a:off x="0" y="0"/>
+                      <a:ext cx="1885950" cy="4451350"/>
+                    </a:xfrm>
+                    <a:prstGeom prst="rect">
+                      <a:avLst/>
+                    </a:prstGeom>
+                  </pic:spPr>
+                </pic:pic>
+              </a:graphicData>
+            </a:graphic>
+            <wp14:sizeRelV relativeFrom="margin">
+              <wp14:pctHeight>0</wp14:pctHeight>
+            </wp14:sizeRelV>
+          </wp:anchor>
+        </w:drawing>
+      </w:r>
+      <w:r>
+        <w:rPr>
+          <w:lang w:val="es-MX"/>
+        </w:rPr>
+        <w:drawing>
+          <wp:anchor distT="0" distB="0" distL="114300" distR="114300" simplePos="0" relativeHeight="251660288" behindDoc="0" locked="0" layoutInCell="1" allowOverlap="1" wp14:anchorId="51A37066" wp14:editId="61C2D030">
+            <wp:simplePos x="0" y="0"/>
+            <wp:positionH relativeFrom="margin">
+              <wp:posOffset>1320800</wp:posOffset>
+            </wp:positionH>
+            <wp:positionV relativeFrom="margin">
+              <wp:posOffset>3648075</wp:posOffset>
+            </wp:positionV>
+            <wp:extent cx="5238115" cy="1804035"/>
+            <wp:effectExtent l="0" t="0" r="635" b="5715"/>
+            <wp:wrapSquare wrapText="bothSides"/>
+            <wp:docPr id="1634916245" name="Imagen 1"/>
+            <wp:cNvGraphicFramePr>
+              <a:graphicFrameLocks xmlns:a="http://schemas.openxmlformats.org/drawingml/2006/main" noChangeAspect="1"/>
+            </wp:cNvGraphicFramePr>
+            <a:graphic xmlns:a="http://schemas.openxmlformats.org/drawingml/2006/main">
+              <a:graphicData uri="http://schemas.openxmlformats.org/drawingml/2006/picture">
+                <pic:pic xmlns:pic="http://schemas.openxmlformats.org/drawingml/2006/picture">
+                  <pic:nvPicPr>
+                    <pic:cNvPr id="1634916245" name=""/>
+                    <pic:cNvPicPr/>
+                  </pic:nvPicPr>
+                  <pic:blipFill>
+                    <a:blip r:embed="rId7" cstate="print">
+                      <a:extLst>
+                        <a:ext uri="{28A0092B-C50C-407E-A947-70E740481C1C}">
+                          <a14:useLocalDpi xmlns:a14="http://schemas.microsoft.com/office/drawing/2010/main" val="0"/>
+                        </a:ext>
+                      </a:extLst>
+                    </a:blip>
+                    <a:stretch>
+                      <a:fillRect/>
+                    </a:stretch>
+                  </pic:blipFill>
+                  <pic:spPr>
+                    <a:xfrm>
+                      <a:off x="0" y="0"/>
+                      <a:ext cx="5238115" cy="1804035"/>
+                    </a:xfrm>
+                    <a:prstGeom prst="rect">
+                      <a:avLst/>
+                    </a:prstGeom>
+                  </pic:spPr>
+                </pic:pic>
+              </a:graphicData>
+            </a:graphic>
+            <wp14:sizeRelH relativeFrom="margin">
+              <wp14:pctWidth>0</wp14:pctWidth>
+            </wp14:sizeRelH>
+          </wp:anchor>
+        </w:drawing>
+      </w:r>
+      <w:r>
+        <w:rPr>
+          <w:lang w:val="es-MX"/>
+        </w:rPr>
+        <w:drawing>
+          <wp:anchor distT="0" distB="0" distL="114300" distR="114300" simplePos="0" relativeHeight="251659264" behindDoc="0" locked="0" layoutInCell="1" allowOverlap="1" wp14:anchorId="5247A9A8" wp14:editId="01C0EFF9">
+            <wp:simplePos x="0" y="0"/>
+            <wp:positionH relativeFrom="margin">
+              <wp:posOffset>1320634</wp:posOffset>
+            </wp:positionH>
+            <wp:positionV relativeFrom="margin">
+              <wp:posOffset>1405918</wp:posOffset>
+            </wp:positionV>
+            <wp:extent cx="5238115" cy="2164715"/>
+            <wp:effectExtent l="0" t="0" r="635" b="6985"/>
+            <wp:wrapSquare wrapText="bothSides"/>
+            <wp:docPr id="460203131" name="Imagen 1"/>
+            <wp:cNvGraphicFramePr>
+              <a:graphicFrameLocks xmlns:a="http://schemas.openxmlformats.org/drawingml/2006/main" noChangeAspect="1"/>
+            </wp:cNvGraphicFramePr>
+            <a:graphic xmlns:a="http://schemas.openxmlformats.org/drawingml/2006/main">
+              <a:graphicData uri="http://schemas.openxmlformats.org/drawingml/2006/picture">
+                <pic:pic xmlns:pic="http://schemas.openxmlformats.org/drawingml/2006/picture">
+                  <pic:nvPicPr>
+                    <pic:cNvPr id="460203131" name=""/>
+                    <pic:cNvPicPr/>
+                  </pic:nvPicPr>
+                  <pic:blipFill>
+                    <a:blip r:embed="rId8" cstate="print">
+                      <a:extLst>
+                        <a:ext uri="{28A0092B-C50C-407E-A947-70E740481C1C}">
+                          <a14:useLocalDpi xmlns:a14="http://schemas.microsoft.com/office/drawing/2010/main" val="0"/>
+                        </a:ext>
+                      </a:extLst>
+                    </a:blip>
+                    <a:stretch>
+                      <a:fillRect/>
+                    </a:stretch>
+                  </pic:blipFill>
+                  <pic:spPr>
+                    <a:xfrm>
+                      <a:off x="0" y="0"/>
+                      <a:ext cx="5238115" cy="2164715"/>
+                    </a:xfrm>
+                    <a:prstGeom prst="rect">
+                      <a:avLst/>
+                    </a:prstGeom>
+                  </pic:spPr>
+                </pic:pic>
+              </a:graphicData>
+            </a:graphic>
+            <wp14:sizeRelH relativeFrom="margin">
+              <wp14:pctWidth>0</wp14:pctWidth>
+            </wp14:sizeRelH>
+          </wp:anchor>
+        </w:drawing>
+      </w:r>
+      <w:r>
+        <w:rPr>
+          <w:lang w:val="es-MX"/>
+        </w:rPr>
+        <w:t>Usuarios:</w:t>
+      </w:r>
+      <w:r>
+        <w:rPr>
+          <w:lang w:val="es-MX"/>
+        </w:rPr>
+        <w:br/>
+        <w:t>En este módulo Solo aparecerán todos los usuarios con el cargo comunicaciones que se crean en el módulo de Generales.</w:t>
+      </w:r>
+    </w:p>
+    <w:p>
+      <w:pPr>
+        <w:pStyle w:val="Prrafodelista"/>
+        <w:numPr>
+          <w:ilvl w:val="2"/>
+          <w:numId w:val="4"/>
+        </w:numPr>
+        <w:rPr>
+          <w:lang w:val="es-MX"/>
+        </w:rPr>
+      </w:pPr>
+      <w:r>
+        <w:rPr>
+          <w:lang w:val="es-MX"/>
+        </w:rPr>
+        <w:t>Permisos:</w:t>
+      </w:r>
+    </w:p>
+    <w:p>
+      <w:pPr>
+        <w:pStyle w:val="Prrafodelista"/>
+        <w:ind w:left="2160"/>
+        <w:rPr>
+          <w:lang w:val="es-MX"/>
+        </w:rPr>
+      </w:pPr>
+      <w:r>
+        <w:rPr>
+          <w:lang w:val="es-MX"/>
+        </w:rPr>
+        <w:t xml:space="preserve">En este módulo de darán acceso a realizar acciones dentro de cada submódulo del módulo de Comunicaciones, acciones tales como dar acceso a otorgar permisos, gestión de anuncios, </w:t>
+      </w:r>
+      <w:r>
+        <w:rPr>
+          <w:lang w:val="es-MX"/>
+        </w:rPr>
+        <w:t>gestión de calendarios, gestión de logros y acreditaciones, y tareas y seguimiento.</w:t>
+      </w:r>
+    </w:p>
+    <w:p>
+      <w:pPr>
+        <w:rPr>
+          <w:lang w:val="es-MX"/>
+        </w:rPr>
+      </w:pPr>
+      <w:r>
+        <w:rPr>
+          <w:lang w:val="es-MX"/>
+        </w:rPr>
+        <w:drawing>
+          <wp:inline distT="0" distB="0" distL="0" distR="0" wp14:anchorId="7F56B096" wp14:editId="504A22CF">
+            <wp:extent cx="5612130" cy="1233170"/>
+            <wp:effectExtent l="0" t="0" r="7620" b="5080"/>
+            <wp:docPr id="5429122" name="Imagen 1"/>
+            <wp:cNvGraphicFramePr>
+              <a:graphicFrameLocks xmlns:a="http://schemas.openxmlformats.org/drawingml/2006/main" noChangeAspect="1"/>
+            </wp:cNvGraphicFramePr>
+            <a:graphic xmlns:a="http://schemas.openxmlformats.org/drawingml/2006/main">
+              <a:graphicData uri="http://schemas.openxmlformats.org/drawingml/2006/picture">
+                <pic:pic xmlns:pic="http://schemas.openxmlformats.org/drawingml/2006/picture">
+                  <pic:nvPicPr>
+                    <pic:cNvPr id="5429122" name=""/>
+                    <pic:cNvPicPr/>
+                  </pic:nvPicPr>
+                  <pic:blipFill>
+                    <a:blip r:embed="rId9"/>
+                    <a:stretch>
+                      <a:fillRect/>
+                    </a:stretch>
+                  </pic:blipFill>
+                  <pic:spPr>
+                    <a:xfrm>
+                      <a:off x="0" y="0"/>
+                      <a:ext cx="5612130" cy="1233170"/>
+                    </a:xfrm>
+                    <a:prstGeom prst="rect">
+                      <a:avLst/>
+                    </a:prstGeom>
+                  </pic:spPr>
+                </pic:pic>
+              </a:graphicData>
+            </a:graphic>
+          </wp:inline>
+        </w:drawing>
+      </w:r>
+    </w:p>
+    <w:p>
+      <w:pPr>
+        <w:rPr>
+          <w:lang w:val="es-MX"/>
+        </w:rPr>
+      </w:pPr>
+      <w:r>
+        <w:rPr>
+          <w:lang w:val="es-MX"/>
+        </w:rPr>
+        <w:lastRenderedPageBreak/>
+        <w:t xml:space="preserve">Este </w:t>
+      </w:r>
+      <w:r>
+        <w:rPr>
+          <w:lang w:val="es-MX"/>
+        </w:rPr>
+        <w:t>módulo</w:t>
+      </w:r>
+      <w:r>
+        <w:rPr>
+          <w:lang w:val="es-MX"/>
+        </w:rPr>
+        <w:t xml:space="preserve"> </w:t>
+      </w:r>
+      <w:r>
+        <w:rPr>
+          <w:lang w:val="es-MX"/>
+        </w:rPr>
+        <w:t>funcionará</w:t>
+      </w:r>
+      <w:r>
+        <w:rPr>
+          <w:lang w:val="es-MX"/>
+        </w:rPr>
+        <w:t xml:space="preserve"> de la siguiente manera; </w:t>
+      </w:r>
+      <w:r>
+        <w:rPr>
+          <w:lang w:val="es-MX"/>
+        </w:rPr>
+        <w:t>tendrá</w:t>
+      </w:r>
+      <w:r>
+        <w:rPr>
+          <w:lang w:val="es-MX"/>
+        </w:rPr>
+        <w:t xml:space="preserve"> la misma apariencia </w:t>
+      </w:r>
+    </w:p>
+    <w:p>
+      <w:pPr>
+        <w:rPr>
+          <w:lang w:val="es-MX"/>
+        </w:rPr>
+      </w:pPr>
+      <w:r>
+        <w:rPr>
+          <w:lang w:val="es-MX"/>
+        </w:rPr>
+        <w:drawing>
+          <wp:inline distT="0" distB="0" distL="0" distR="0" wp14:anchorId="2830F30F" wp14:editId="579036ED">
+            <wp:extent cx="5612130" cy="2219960"/>
+            <wp:effectExtent l="0" t="0" r="7620" b="8890"/>
+            <wp:docPr id="1250553501" name="Imagen 1"/>
+            <wp:cNvGraphicFramePr>
+              <a:graphicFrameLocks xmlns:a="http://schemas.openxmlformats.org/drawingml/2006/main" noChangeAspect="1"/>
+            </wp:cNvGraphicFramePr>
+            <a:graphic xmlns:a="http://schemas.openxmlformats.org/drawingml/2006/main">
+              <a:graphicData uri="http://schemas.openxmlformats.org/drawingml/2006/picture">
+                <pic:pic xmlns:pic="http://schemas.openxmlformats.org/drawingml/2006/picture">
+                  <pic:nvPicPr>
+                    <pic:cNvPr id="1250553501" name=""/>
+                    <pic:cNvPicPr/>
+                  </pic:nvPicPr>
+                  <pic:blipFill>
+                    <a:blip r:embed="rId10"/>
+                    <a:stretch>
+                      <a:fillRect/>
+                    </a:stretch>
+                  </pic:blipFill>
+                  <pic:spPr>
+                    <a:xfrm>
+                      <a:off x="0" y="0"/>
+                      <a:ext cx="5612130" cy="2219960"/>
+                    </a:xfrm>
+                    <a:prstGeom prst="rect">
+                      <a:avLst/>
+                    </a:prstGeom>
+                  </pic:spPr>
+                </pic:pic>
+              </a:graphicData>
+            </a:graphic>
+          </wp:inline>
+        </w:drawing>
+      </w:r>
+    </w:p>
+    <w:p>
+      <w:pPr>
+        <w:rPr>
+          <w:lang w:val="es-MX"/>
+        </w:rPr>
+      </w:pPr>
+      <w:r>
+        <w:rPr>
+          <w:lang w:val="es-MX"/>
+        </w:rPr>
+        <w:t>Donde aparecerán cada módulo y submódulo del panel administrador de las comunicaciones, por ahora hazlo con esta apariencia, después lo pondremos con esta función, pero que tenga los referentes al módulo de comunicaciones.</w:t>
+      </w:r>
+    </w:p>
+    <w:p>
+      <w:pPr>
+        <w:pStyle w:val="Prrafodelista"/>
+        <w:numPr>
+          <w:ilvl w:val="1"/>
+          <w:numId w:val="4"/>
+        </w:numPr>
+        <w:rPr>
+          <w:lang w:val="es-MX"/>
+        </w:rPr>
+      </w:pPr>
+      <w:r>
+        <w:rPr>
+          <w:lang w:val="es-MX"/>
+        </w:rPr>
+        <w:t>Carpeta Anuncios:</w:t>
+      </w:r>
+    </w:p>
+    <w:p>
+      <w:pPr>
+        <w:pStyle w:val="Prrafodelista"/>
+        <w:numPr>
+          <w:ilvl w:val="2"/>
+          <w:numId w:val="4"/>
+        </w:numPr>
+        <w:rPr>
+          <w:lang w:val="es-MX"/>
+        </w:rPr>
+      </w:pPr>
+      <w:r>
+        <w:rPr>
+          <w:lang w:val="es-MX"/>
+        </w:rPr>
+        <w:t>Crear anuncio:</w:t>
+      </w:r>
+    </w:p>
+    <w:p>
+      <w:pPr>
+        <w:pStyle w:val="Prrafodelista"/>
+        <w:ind w:left="2160"/>
+        <w:rPr>
+          <w:lang w:val="es-MX"/>
+        </w:rPr>
+      </w:pPr>
+      <w:r>
+        <w:rPr>
+          <w:lang w:val="es-MX"/>
+        </w:rPr>
+        <w:t>este crea una tabla donde aparezcan todos los anuncios, y arriba aparezca un botón que se llame “Crear Anuncio” y de desplegué un modal con los datos a solicitar para el registro, quita la opción de “Publicar automáticamente al crear”.</w:t>
+      </w:r>
+    </w:p>
+    <w:p>
+      <w:pPr>
+        <w:rPr>
+          <w:lang w:val="es-MX"/>
+        </w:rPr>
+      </w:pPr>
+      <w:r>
+        <w:rPr>
+          <w:lang w:val="es-MX"/>
+        </w:rPr>
+        <w:drawing>
+          <wp:inline distT="0" distB="0" distL="0" distR="0" wp14:anchorId="4D9B0325" wp14:editId="05E2EE57">
+            <wp:extent cx="5612130" cy="2794000"/>
+            <wp:effectExtent l="0" t="0" r="7620" b="6350"/>
+            <wp:docPr id="486303566" name="Imagen 1"/>
+            <wp:cNvGraphicFramePr>
+              <a:graphicFrameLocks xmlns:a="http://schemas.openxmlformats.org/drawingml/2006/main" noChangeAspect="1"/>
+            </wp:cNvGraphicFramePr>
+            <a:graphic xmlns:a="http://schemas.openxmlformats.org/drawingml/2006/main">
+              <a:graphicData uri="http://schemas.openxmlformats.org/drawingml/2006/picture">
+                <pic:pic xmlns:pic="http://schemas.openxmlformats.org/drawingml/2006/picture">
+                  <pic:nvPicPr>
+                    <pic:cNvPr id="486303566" name=""/>
+                    <pic:cNvPicPr/>
+                  </pic:nvPicPr>
+                  <pic:blipFill>
+                    <a:blip r:embed="rId11"/>
+                    <a:stretch>
+                      <a:fillRect/>
+                    </a:stretch>
+                  </pic:blipFill>
+                  <pic:spPr>
+                    <a:xfrm>
+                      <a:off x="0" y="0"/>
+                      <a:ext cx="5612130" cy="2794000"/>
+                    </a:xfrm>
+                    <a:prstGeom prst="rect">
+                      <a:avLst/>
+                    </a:prstGeom>
+                  </pic:spPr>
+                </pic:pic>
+              </a:graphicData>
+            </a:graphic>
+          </wp:inline>
+        </w:drawing>
+      </w:r>
+    </w:p>
+    <w:p>
+      <w:pPr>
+        <w:rPr>
+          <w:lang w:val="es-MX"/>
+        </w:rPr>
+      </w:pPr>
+    </w:p>
+    <w:p>
+      <w:pPr>
+        <w:rPr>
+          <w:lang w:val="es-MX"/>
+        </w:rPr>
+      </w:pPr>
+    </w:p>
+    <w:p>
+      <w:pPr>
+        <w:pStyle w:val="Prrafodelista"/>
+        <w:numPr>
+          <w:ilvl w:val="2"/>
+          <w:numId w:val="4"/>
+        </w:numPr>
+        <w:rPr>
+          <w:lang w:val="es-MX"/>
+        </w:rPr>
+      </w:pPr>
+      <w:r>
+        <w:rPr>
+          <w:lang w:val="es-MX"/>
+        </w:rPr>
+        <w:lastRenderedPageBreak/>
+        <w:t>Calendario de Anuncios:</w:t>
+      </w:r>
+    </w:p>
+    <w:p>
+      <w:pPr>
+        <w:pStyle w:val="Prrafodelista"/>
+        <w:ind w:left="2160"/>
+        <w:rPr>
+          <w:lang w:val="es-MX"/>
+        </w:rPr>
+      </w:pPr>
+      <w:r>
+        <w:rPr>
+          <w:lang w:val="es-MX"/>
+        </w:rPr>
+        <w:t>Todos los anuncios que se registren deben de aparecer en una lista debajo de los dos espacios que son el calendario y la tabla que esta al lado, con los anuncios próximos a cargar en el panel de anuncios</w:t>
+      </w:r>
+      <w:r>
+        <w:rPr>
+          <w:lang w:val="es-MX"/>
+        </w:rPr>
+        <w:t>, este debe tener un botón de vista previa, de como se verá en el panel publico.</w:t>
+      </w:r>
+    </w:p>
+    <w:p>
+      <w:pPr>
+        <w:rPr>
+          <w:lang w:val="es-MX"/>
+        </w:rPr>
+      </w:pPr>
+      <w:r>
+        <w:rPr>
+          <w:lang w:val="es-MX"/>
+        </w:rPr>
+        <w:drawing>
+          <wp:inline distT="0" distB="0" distL="0" distR="0" wp14:anchorId="1CA2DCFC" wp14:editId="11B10C38">
+            <wp:extent cx="5612130" cy="2788285"/>
+            <wp:effectExtent l="0" t="0" r="7620" b="0"/>
+            <wp:docPr id="710734507" name="Imagen 1"/>
+            <wp:cNvGraphicFramePr>
+              <a:graphicFrameLocks xmlns:a="http://schemas.openxmlformats.org/drawingml/2006/main" noChangeAspect="1"/>
+            </wp:cNvGraphicFramePr>
+            <a:graphic xmlns:a="http://schemas.openxmlformats.org/drawingml/2006/main">
+              <a:graphicData uri="http://schemas.openxmlformats.org/drawingml/2006/picture">
+                <pic:pic xmlns:pic="http://schemas.openxmlformats.org/drawingml/2006/picture">
+                  <pic:nvPicPr>
+                    <pic:cNvPr id="710734507" name=""/>
+                    <pic:cNvPicPr/>
+                  </pic:nvPicPr>
+                  <pic:blipFill>
+                    <a:blip r:embed="rId12"/>
                     <a:stretch>
                       <a:fillRect/>
                     </a:stretch>
@@ -97,236 +658,11 @@
         <w:rPr>
           <w:lang w:val="es-MX"/>
         </w:rPr>
-        <w:t>En el panel de inicio de sección, debajo del botón INGRESAR, colocar texto que diga “Solicitar Acceso” genere un modal que muestre los siguientes datos:</w:t>
-      </w:r>
-    </w:p>
-    <w:p>
-      <w:pPr>
-        <w:pStyle w:val="Prrafodelista"/>
-        <w:numPr>
-          <w:ilvl w:val="0"/>
-          <w:numId w:val="1"/>
-        </w:numPr>
-        <w:rPr>
-          <w:lang w:val="es-MX"/>
-        </w:rPr>
-      </w:pPr>
-      <w:r>
-        <w:rPr>
-          <w:lang w:val="es-MX"/>
-        </w:rPr>
-        <w:t>Primer Nombre (Obligatorio)</w:t>
-      </w:r>
-    </w:p>
-    <w:p>
-      <w:pPr>
-        <w:pStyle w:val="Prrafodelista"/>
-        <w:numPr>
-          <w:ilvl w:val="0"/>
-          <w:numId w:val="1"/>
-        </w:numPr>
-        <w:rPr>
-          <w:lang w:val="es-MX"/>
-        </w:rPr>
-      </w:pPr>
-      <w:r>
-        <w:rPr>
-          <w:lang w:val="es-MX"/>
-        </w:rPr>
-        <w:t>Segundo Nombre (Opcional)</w:t>
-      </w:r>
-    </w:p>
-    <w:p>
-      <w:pPr>
-        <w:pStyle w:val="Prrafodelista"/>
-        <w:numPr>
-          <w:ilvl w:val="0"/>
-          <w:numId w:val="1"/>
-        </w:numPr>
-        <w:rPr>
-          <w:lang w:val="es-MX"/>
-        </w:rPr>
-      </w:pPr>
-      <w:r>
-        <w:rPr>
-          <w:lang w:val="es-MX"/>
-        </w:rPr>
-        <w:t>Primer Apellido</w:t>
-      </w:r>
-      <w:r>
-        <w:rPr>
-          <w:lang w:val="es-MX"/>
-        </w:rPr>
-        <w:t xml:space="preserve"> (Obligatorio)</w:t>
-      </w:r>
-    </w:p>
-    <w:p>
-      <w:pPr>
-        <w:pStyle w:val="Prrafodelista"/>
-        <w:numPr>
-          <w:ilvl w:val="0"/>
-          <w:numId w:val="1"/>
-        </w:numPr>
-        <w:rPr>
-          <w:lang w:val="es-MX"/>
-        </w:rPr>
-      </w:pPr>
-      <w:r>
-        <w:rPr>
-          <w:lang w:val="es-MX"/>
-        </w:rPr>
-        <w:t>Segundo apellido</w:t>
-      </w:r>
-      <w:r>
-        <w:rPr>
-          <w:lang w:val="es-MX"/>
-        </w:rPr>
-        <w:t xml:space="preserve"> (Obligatorio)</w:t>
-      </w:r>
-    </w:p>
-    <w:p>
-      <w:pPr>
-        <w:pStyle w:val="Prrafodelista"/>
-        <w:numPr>
-          <w:ilvl w:val="0"/>
-          <w:numId w:val="1"/>
-        </w:numPr>
-        <w:rPr>
-          <w:lang w:val="es-MX"/>
-        </w:rPr>
-      </w:pPr>
-      <w:r>
-        <w:rPr>
-          <w:lang w:val="es-MX"/>
-        </w:rPr>
-        <w:t>Numero de Identificación</w:t>
-      </w:r>
-      <w:r>
-        <w:rPr>
-          <w:lang w:val="es-MX"/>
-        </w:rPr>
-        <w:t xml:space="preserve"> (Obligatorio)</w:t>
-      </w:r>
-    </w:p>
-    <w:p>
-      <w:pPr>
-        <w:pStyle w:val="Prrafodelista"/>
-        <w:numPr>
-          <w:ilvl w:val="0"/>
-          <w:numId w:val="1"/>
-        </w:numPr>
-        <w:rPr>
-          <w:lang w:val="es-MX"/>
-        </w:rPr>
-      </w:pPr>
-      <w:r>
-        <w:rPr>
-          <w:lang w:val="es-MX"/>
-        </w:rPr>
-        <w:t>Email Corporativo</w:t>
-      </w:r>
-      <w:r>
-        <w:rPr>
-          <w:lang w:val="es-MX"/>
-        </w:rPr>
-        <w:t xml:space="preserve"> (Obligatorio)</w:t>
-      </w:r>
-    </w:p>
-    <w:p>
-      <w:pPr>
-        <w:pStyle w:val="Prrafodelista"/>
-        <w:numPr>
-          <w:ilvl w:val="0"/>
-          <w:numId w:val="1"/>
-        </w:numPr>
-        <w:rPr>
-          <w:lang w:val="es-MX"/>
-        </w:rPr>
-      </w:pPr>
-      <w:r>
-        <w:rPr>
-          <w:lang w:val="es-MX"/>
-        </w:rPr>
-        <w:t>Numero de Celular</w:t>
-      </w:r>
-      <w:r>
-        <w:rPr>
-          <w:lang w:val="es-MX"/>
-        </w:rPr>
-        <w:t xml:space="preserve"> (Obligatorio)</w:t>
-      </w:r>
-    </w:p>
-    <w:p>
-      <w:pPr>
-        <w:pStyle w:val="Prrafodelista"/>
-        <w:numPr>
-          <w:ilvl w:val="0"/>
-          <w:numId w:val="1"/>
-        </w:numPr>
-        <w:rPr>
-          <w:lang w:val="es-MX"/>
-        </w:rPr>
-      </w:pPr>
-      <w:r>
-        <w:rPr>
-          <w:lang w:val="es-MX"/>
-        </w:rPr>
-        <w:t>Cargo del Usuario</w:t>
-      </w:r>
-      <w:r>
-        <w:rPr>
-          <w:lang w:val="es-MX"/>
-        </w:rPr>
-        <w:t xml:space="preserve"> (Obligatorio)</w:t>
-      </w:r>
-    </w:p>
-    <w:p>
-      <w:pPr>
-        <w:pStyle w:val="Prrafodelista"/>
-        <w:numPr>
-          <w:ilvl w:val="0"/>
-          <w:numId w:val="1"/>
-        </w:numPr>
-        <w:rPr>
-          <w:lang w:val="es-MX"/>
-        </w:rPr>
-      </w:pPr>
-      <w:r>
-        <w:rPr>
-          <w:lang w:val="es-MX"/>
-        </w:rPr>
-        <w:t>Fecha de Nacimiento</w:t>
-      </w:r>
-      <w:r>
-        <w:rPr>
-          <w:lang w:val="es-MX"/>
-        </w:rPr>
-        <w:t xml:space="preserve"> (Obligatorio)</w:t>
-      </w:r>
-    </w:p>
-    <w:p>
-      <w:pPr>
-        <w:rPr>
-          <w:lang w:val="es-MX"/>
-        </w:rPr>
-      </w:pPr>
-      <w:r>
-        <w:rPr>
-          <w:lang w:val="es-MX"/>
-        </w:rPr>
         <w:drawing>
-          <wp:anchor distT="0" distB="0" distL="114300" distR="114300" simplePos="0" relativeHeight="251658240" behindDoc="0" locked="0" layoutInCell="1" allowOverlap="1" wp14:anchorId="44AF9F64" wp14:editId="35864839">
-            <wp:simplePos x="0" y="0"/>
-            <wp:positionH relativeFrom="margin">
-              <wp:align>center</wp:align>
-            </wp:positionH>
-            <wp:positionV relativeFrom="margin">
-              <wp:posOffset>6396902</wp:posOffset>
-            </wp:positionV>
-            <wp:extent cx="3178810" cy="2476500"/>
-            <wp:effectExtent l="0" t="0" r="2540" b="0"/>
-            <wp:wrapSquare wrapText="bothSides"/>
-            <wp:docPr id="1061385689" name="Imagen 1"/>
+          <wp:inline distT="0" distB="0" distL="0" distR="0" wp14:anchorId="413CD11C" wp14:editId="6058DADE">
+            <wp:extent cx="5612130" cy="2792730"/>
+            <wp:effectExtent l="0" t="0" r="7620" b="7620"/>
+            <wp:docPr id="1492504364" name="Imagen 1"/>
             <wp:cNvGraphicFramePr>
               <a:graphicFrameLocks xmlns:a="http://schemas.openxmlformats.org/drawingml/2006/main" noChangeAspect="1"/>
             </wp:cNvGraphicFramePr>
@@ -334,17 +670,11 @@
               <a:graphicData uri="http://schemas.openxmlformats.org/drawingml/2006/picture">
                 <pic:pic xmlns:pic="http://schemas.openxmlformats.org/drawingml/2006/picture">
                   <pic:nvPicPr>
-                    <pic:cNvPr id="1061385689" name=""/>
+                    <pic:cNvPr id="1492504364" name=""/>
                     <pic:cNvPicPr/>
                   </pic:nvPicPr>
                   <pic:blipFill>
-                    <a:blip r:embed="rId6" cstate="print">
-                      <a:extLst>
-                        <a:ext uri="{28A0092B-C50C-407E-A947-70E740481C1C}">
-                          <a14:useLocalDpi xmlns:a14="http://schemas.microsoft.com/office/drawing/2010/main" val="0"/>
-                        </a:ext>
-                      </a:extLst>
-                    </a:blip>
+                    <a:blip r:embed="rId13"/>
                     <a:stretch>
                       <a:fillRect/>
                     </a:stretch>
@@ -352,497 +682,7 @@
                   <pic:spPr>
                     <a:xfrm>
                       <a:off x="0" y="0"/>
-                      <a:ext cx="3178810" cy="2476500"/>
-                    </a:xfrm>
-                    <a:prstGeom prst="rect">
-                      <a:avLst/>
-                    </a:prstGeom>
-                  </pic:spPr>
-                </pic:pic>
-              </a:graphicData>
-            </a:graphic>
-            <wp14:sizeRelH relativeFrom="margin">
-              <wp14:pctWidth>0</wp14:pctWidth>
-            </wp14:sizeRelH>
-            <wp14:sizeRelV relativeFrom="margin">
-              <wp14:pctHeight>0</wp14:pctHeight>
-            </wp14:sizeRelV>
-          </wp:anchor>
-        </w:drawing>
-      </w:r>
-      <w:r>
-        <w:rPr>
-          <w:lang w:val="es-MX"/>
-        </w:rPr>
-        <w:t>Este debe tener el mismo estilo del modal de creación de usuario.</w:t>
-      </w:r>
-    </w:p>
-    <w:p>
-      <w:pPr>
-        <w:rPr>
-          <w:lang w:val="es-MX"/>
-        </w:rPr>
-      </w:pPr>
-      <w:r>
-        <w:rPr>
-          <w:lang w:val="es-MX"/>
-        </w:rPr>
-        <w:br w:type="page"/>
-      </w:r>
-    </w:p>
-    <w:p>
-      <w:pPr>
-        <w:rPr>
-          <w:lang w:val="es-MX"/>
-        </w:rPr>
-      </w:pPr>
-      <w:r>
-        <w:rPr>
-          <w:lang w:val="es-MX"/>
-        </w:rPr>
-        <w:lastRenderedPageBreak/>
-        <w:t>Una vez el usuario de clic en el botón que diga “Solicitar acceso” este debe llegar a modulo de solicitudes del panel administrativo</w:t>
-      </w:r>
-    </w:p>
-    <w:p>
-      <w:pPr>
-        <w:rPr>
-          <w:lang w:val="es-MX"/>
-        </w:rPr>
-      </w:pPr>
-      <w:r>
-        <w:rPr>
-          <w:noProof/>
-        </w:rPr>
-        <w:drawing>
-          <wp:inline distT="0" distB="0" distL="0" distR="0" wp14:anchorId="39312FEF" wp14:editId="6278D39B">
-            <wp:extent cx="5612130" cy="2788285"/>
-            <wp:effectExtent l="0" t="0" r="7620" b="0"/>
-            <wp:docPr id="1688600508" name="Imagen 1"/>
-            <wp:cNvGraphicFramePr>
-              <a:graphicFrameLocks xmlns:a="http://schemas.openxmlformats.org/drawingml/2006/main" noChangeAspect="1"/>
-            </wp:cNvGraphicFramePr>
-            <a:graphic xmlns:a="http://schemas.openxmlformats.org/drawingml/2006/main">
-              <a:graphicData uri="http://schemas.openxmlformats.org/drawingml/2006/picture">
-                <pic:pic xmlns:pic="http://schemas.openxmlformats.org/drawingml/2006/picture">
-                  <pic:nvPicPr>
-                    <pic:cNvPr id="1688600508" name=""/>
-                    <pic:cNvPicPr/>
-                  </pic:nvPicPr>
-                  <pic:blipFill>
-                    <a:blip r:embed="rId7"/>
-                    <a:stretch>
-                      <a:fillRect/>
-                    </a:stretch>
-                  </pic:blipFill>
-                  <pic:spPr>
-                    <a:xfrm>
-                      <a:off x="0" y="0"/>
-                      <a:ext cx="5612130" cy="2788285"/>
-                    </a:xfrm>
-                    <a:prstGeom prst="rect">
-                      <a:avLst/>
-                    </a:prstGeom>
-                  </pic:spPr>
-                </pic:pic>
-              </a:graphicData>
-            </a:graphic>
-          </wp:inline>
-        </w:drawing>
-      </w:r>
-    </w:p>
-    <w:p>
-      <w:pPr>
-        <w:rPr>
-          <w:lang w:val="es-MX"/>
-        </w:rPr>
-      </w:pPr>
-      <w:r>
-        <w:rPr>
-          <w:lang w:val="es-MX"/>
-        </w:rPr>
-        <w:t>En la tabla de solicitudes de usuarios debe aparecer lo siguiente:</w:t>
-      </w:r>
-    </w:p>
-    <w:p>
-      <w:pPr>
-        <w:pStyle w:val="Prrafodelista"/>
-        <w:numPr>
-          <w:ilvl w:val="0"/>
-          <w:numId w:val="2"/>
-        </w:numPr>
-        <w:rPr>
-          <w:lang w:val="es-MX"/>
-        </w:rPr>
-      </w:pPr>
-      <w:r>
-        <w:rPr>
-          <w:lang w:val="es-MX"/>
-        </w:rPr>
-        <w:t>Identificacion</w:t>
-      </w:r>
-    </w:p>
-    <w:p>
-      <w:pPr>
-        <w:pStyle w:val="Prrafodelista"/>
-        <w:numPr>
-          <w:ilvl w:val="0"/>
-          <w:numId w:val="2"/>
-        </w:numPr>
-        <w:rPr>
-          <w:lang w:val="es-MX"/>
-        </w:rPr>
-      </w:pPr>
-      <w:r>
-        <w:rPr>
-          <w:lang w:val="es-MX"/>
-        </w:rPr>
-        <w:t>Nombre completo (debe aparecer en línea primer nombre + segundo nombre + primer apellido + segundo apellido)</w:t>
-      </w:r>
-    </w:p>
-    <w:p>
-      <w:pPr>
-        <w:pStyle w:val="Prrafodelista"/>
-        <w:numPr>
-          <w:ilvl w:val="0"/>
-          <w:numId w:val="2"/>
-        </w:numPr>
-        <w:rPr>
-          <w:lang w:val="es-MX"/>
-        </w:rPr>
-      </w:pPr>
-      <w:r>
-        <w:rPr>
-          <w:lang w:val="es-MX"/>
-        </w:rPr>
-        <w:t>Cargo</w:t>
-      </w:r>
-    </w:p>
-    <w:p>
-      <w:pPr>
-        <w:pStyle w:val="Prrafodelista"/>
-        <w:numPr>
-          <w:ilvl w:val="0"/>
-          <w:numId w:val="2"/>
-        </w:numPr>
-        <w:rPr>
-          <w:lang w:val="es-MX"/>
-        </w:rPr>
-      </w:pPr>
-      <w:r>
-        <w:rPr>
-          <w:lang w:val="es-MX"/>
-        </w:rPr>
-        <w:t>Email Corporativo</w:t>
-      </w:r>
-    </w:p>
-    <w:p>
-      <w:pPr>
-        <w:pStyle w:val="Prrafodelista"/>
-        <w:numPr>
-          <w:ilvl w:val="0"/>
-          <w:numId w:val="2"/>
-        </w:numPr>
-        <w:rPr>
-          <w:lang w:val="es-MX"/>
-        </w:rPr>
-      </w:pPr>
-      <w:r>
-        <w:rPr>
-          <w:lang w:val="es-MX"/>
-        </w:rPr>
-        <w:t>Estado (Solicitud, Aprobado, Rechazado)</w:t>
-      </w:r>
-    </w:p>
-    <w:p>
-      <w:pPr>
-        <w:pStyle w:val="Prrafodelista"/>
-        <w:numPr>
-          <w:ilvl w:val="0"/>
-          <w:numId w:val="2"/>
-        </w:numPr>
-        <w:rPr>
-          <w:lang w:val="es-MX"/>
-        </w:rPr>
-      </w:pPr>
-      <w:r>
-        <w:rPr>
-          <w:lang w:val="es-MX"/>
-        </w:rPr>
-        <w:t>Acciones</w:t>
-      </w:r>
-    </w:p>
-    <w:p>
-      <w:pPr>
-        <w:pStyle w:val="Prrafodelista"/>
-        <w:numPr>
-          <w:ilvl w:val="1"/>
-          <w:numId w:val="2"/>
-        </w:numPr>
-        <w:rPr>
-          <w:lang w:val="es-MX"/>
-        </w:rPr>
-      </w:pPr>
-      <w:r>
-        <w:rPr>
-          <w:lang w:val="es-MX"/>
-        </w:rPr>
-        <w:t>Consultar: aquí con esto botón de deben de consultar todos los datos que el usuario registro</w:t>
-      </w:r>
-    </w:p>
-    <w:p>
-      <w:pPr>
-        <w:pStyle w:val="Prrafodelista"/>
-        <w:numPr>
-          <w:ilvl w:val="1"/>
-          <w:numId w:val="2"/>
-        </w:numPr>
-        <w:rPr>
-          <w:lang w:val="es-MX"/>
-        </w:rPr>
-      </w:pPr>
-      <w:r>
-        <w:rPr>
-          <w:lang w:val="es-MX"/>
-        </w:rPr>
-        <w:t>Aprobar: debe cargar un modal como el de registro de usuario pero agregar los siguientes nuevos campos</w:t>
-      </w:r>
-    </w:p>
-    <w:p>
-      <w:pPr>
-        <w:pStyle w:val="Prrafodelista"/>
-        <w:numPr>
-          <w:ilvl w:val="2"/>
-          <w:numId w:val="2"/>
-        </w:numPr>
-        <w:rPr>
-          <w:lang w:val="es-MX"/>
-        </w:rPr>
-      </w:pPr>
-      <w:r>
-        <w:rPr>
-          <w:lang w:val="es-MX"/>
-        </w:rPr>
-        <w:t xml:space="preserve">Nombre de Usuario (primero nombre + . + Primero apellido) este lo debe cargar automática </w:t>
-      </w:r>
-      <w:r>
-        <w:rPr>
-          <w:lang w:val="es-MX"/>
-        </w:rPr>
-        <w:t>de los datos que registro el usuario, debe permitir modificar</w:t>
-      </w:r>
-    </w:p>
-    <w:p>
-      <w:pPr>
-        <w:pStyle w:val="Prrafodelista"/>
-        <w:numPr>
-          <w:ilvl w:val="2"/>
-          <w:numId w:val="2"/>
-        </w:numPr>
-        <w:rPr>
-          <w:lang w:val="es-MX"/>
-        </w:rPr>
-      </w:pPr>
-      <w:r>
-        <w:rPr>
-          <w:lang w:val="es-MX"/>
-        </w:rPr>
-        <w:t>Contraseña</w:t>
-      </w:r>
-    </w:p>
-    <w:p>
-      <w:pPr>
-        <w:pStyle w:val="Prrafodelista"/>
-        <w:numPr>
-          <w:ilvl w:val="2"/>
-          <w:numId w:val="2"/>
-        </w:numPr>
-        <w:rPr>
-          <w:lang w:val="es-MX"/>
-        </w:rPr>
-      </w:pPr>
-      <w:r>
-        <w:rPr>
-          <w:lang w:val="es-MX"/>
-        </w:rPr>
-        <w:t>Cargo para permisos</w:t>
-      </w:r>
-    </w:p>
-    <w:p>
-      <w:pPr>
-        <w:pStyle w:val="Prrafodelista"/>
-        <w:numPr>
-          <w:ilvl w:val="2"/>
-          <w:numId w:val="2"/>
-        </w:numPr>
-        <w:rPr>
-          <w:lang w:val="es-MX"/>
-        </w:rPr>
-      </w:pPr>
-      <w:r>
-        <w:rPr>
-          <w:lang w:val="es-MX"/>
-        </w:rPr>
-        <w:t>En vez de aparecer los 4 campos de primer nombre, segundo nombre, primer apellido, segundo apellido, establecer un solo campo que se llame “Nombre completo” que muestre primer nombre + segundo nombre + primer apellido + segundo apellido</w:t>
-      </w:r>
-    </w:p>
-    <w:p>
-      <w:pPr>
-        <w:pStyle w:val="Prrafodelista"/>
-        <w:numPr>
-          <w:ilvl w:val="1"/>
-          <w:numId w:val="2"/>
-        </w:numPr>
-        <w:rPr>
-          <w:lang w:val="es-MX"/>
-        </w:rPr>
-      </w:pPr>
-      <w:r>
-        <w:rPr>
-          <w:lang w:val="es-MX"/>
-        </w:rPr>
-        <w:lastRenderedPageBreak/>
-        <w:t>Rechazar: si rechazo el usuario este queda rechazo, pero puede aprobarse luego.</w:t>
-      </w:r>
-    </w:p>
-    <w:p>
-      <w:pPr>
-        <w:rPr>
-          <w:lang w:val="es-MX"/>
-        </w:rPr>
-      </w:pPr>
-      <w:r>
-        <w:rPr>
-          <w:lang w:val="es-MX"/>
-        </w:rPr>
-        <w:t>En caso tal se realice una solicitud este debe validar contra el usuario el numero de identificación, si el numero de identificación del usuario solicitante se encuentra en los registros de numero de identificación del usuario, debe informar “usuario ya se encuentra creado en el sistema”.</w:t>
-      </w:r>
-    </w:p>
-    <w:p>
-      <w:pPr>
-        <w:rPr>
-          <w:noProof/>
-          <w:lang w:val="es-MX"/>
-        </w:rPr>
-      </w:pPr>
-      <w:r>
-        <w:rPr>
-          <w:lang w:val="es-MX"/>
-        </w:rPr>
-        <w:t>2. En el modulo de gestión de usuario:</w:t>
-      </w:r>
-      <w:r>
-        <w:rPr>
-          <w:noProof/>
-        </w:rPr>
-        <w:t xml:space="preserve"> </w:t>
-      </w:r>
-      <w:r>
-        <w:rPr>
-          <w:lang w:val="es-MX"/>
-        </w:rPr>
-        <w:drawing>
-          <wp:inline distT="0" distB="0" distL="0" distR="0" wp14:anchorId="5549FD76" wp14:editId="2D7D717D">
-            <wp:extent cx="5612130" cy="1127760"/>
-            <wp:effectExtent l="0" t="0" r="7620" b="0"/>
-            <wp:docPr id="362744487" name="Imagen 1"/>
-            <wp:cNvGraphicFramePr>
-              <a:graphicFrameLocks xmlns:a="http://schemas.openxmlformats.org/drawingml/2006/main" noChangeAspect="1"/>
-            </wp:cNvGraphicFramePr>
-            <a:graphic xmlns:a="http://schemas.openxmlformats.org/drawingml/2006/main">
-              <a:graphicData uri="http://schemas.openxmlformats.org/drawingml/2006/picture">
-                <pic:pic xmlns:pic="http://schemas.openxmlformats.org/drawingml/2006/picture">
-                  <pic:nvPicPr>
-                    <pic:cNvPr id="362744487" name=""/>
-                    <pic:cNvPicPr/>
-                  </pic:nvPicPr>
-                  <pic:blipFill>
-                    <a:blip r:embed="rId8"/>
-                    <a:stretch>
-                      <a:fillRect/>
-                    </a:stretch>
-                  </pic:blipFill>
-                  <pic:spPr>
-                    <a:xfrm>
-                      <a:off x="0" y="0"/>
-                      <a:ext cx="5612130" cy="1127760"/>
-                    </a:xfrm>
-                    <a:prstGeom prst="rect">
-                      <a:avLst/>
-                    </a:prstGeom>
-                  </pic:spPr>
-                </pic:pic>
-              </a:graphicData>
-            </a:graphic>
-          </wp:inline>
-        </w:drawing>
-      </w:r>
-    </w:p>
-    <w:p>
-      <w:pPr>
-        <w:rPr>
-          <w:noProof/>
-          <w:lang w:val="es-MX"/>
-        </w:rPr>
-      </w:pPr>
-      <w:r>
-        <w:rPr>
-          <w:noProof/>
-          <w:lang w:val="es-MX"/>
-        </w:rPr>
-        <w:t>Existe un boton con una llave que referencia al restablecimiento de contraseña, este al dar clic restablece la contraseña por el numero de documento, cambiaremos la logica, al dar clic debe solictar en un modal la contraseña a restablecer, donde el usuario ingrese la contraseña y se restablezca por esa.</w:t>
-      </w:r>
-    </w:p>
-    <w:p>
-      <w:pPr>
-        <w:rPr>
-          <w:noProof/>
-          <w:lang w:val="es-MX"/>
-        </w:rPr>
-      </w:pPr>
-      <w:r>
-        <w:rPr>
-          <w:noProof/>
-          <w:lang w:val="es-MX"/>
-        </w:rPr>
-        <w:t>Adicional a eso, quita esa ventana de infomacion y colocalo como una notifiacion en el cotado inferior derecho donde diga este mensaje.</w:t>
-      </w:r>
-    </w:p>
-    <w:p>
-      <w:pPr>
-        <w:rPr>
-          <w:lang w:val="es-MX"/>
-        </w:rPr>
-      </w:pPr>
-      <w:r>
-        <w:rPr>
-          <w:lang w:val="es-MX"/>
-        </w:rPr>
-        <w:drawing>
-          <wp:inline distT="0" distB="0" distL="0" distR="0" wp14:anchorId="62C1E65A" wp14:editId="32793AA1">
-            <wp:extent cx="5612130" cy="2926080"/>
-            <wp:effectExtent l="0" t="0" r="7620" b="7620"/>
-            <wp:docPr id="15623623" name="Imagen 1"/>
-            <wp:cNvGraphicFramePr>
-              <a:graphicFrameLocks xmlns:a="http://schemas.openxmlformats.org/drawingml/2006/main" noChangeAspect="1"/>
-            </wp:cNvGraphicFramePr>
-            <a:graphic xmlns:a="http://schemas.openxmlformats.org/drawingml/2006/main">
-              <a:graphicData uri="http://schemas.openxmlformats.org/drawingml/2006/picture">
-                <pic:pic xmlns:pic="http://schemas.openxmlformats.org/drawingml/2006/picture">
-                  <pic:nvPicPr>
-                    <pic:cNvPr id="15623623" name=""/>
-                    <pic:cNvPicPr/>
-                  </pic:nvPicPr>
-                  <pic:blipFill>
-                    <a:blip r:embed="rId9"/>
-                    <a:stretch>
-                      <a:fillRect/>
-                    </a:stretch>
-                  </pic:blipFill>
-                  <pic:spPr>
-                    <a:xfrm>
-                      <a:off x="0" y="0"/>
-                      <a:ext cx="5612130" cy="2926080"/>
+                      <a:ext cx="5612130" cy="2792730"/>
                     </a:xfrm>
                     <a:prstGeom prst="rect">
                       <a:avLst/>
@@ -1093,11 +933,305 @@
       </w:rPr>
     </w:lvl>
   </w:abstractNum>
+  <w:abstractNum w:abstractNumId="2" w15:restartNumberingAfterBreak="0">
+    <w:nsid w:val="3D1A40C9"/>
+    <w:multiLevelType w:val="hybridMultilevel"/>
+    <w:tmpl w:val="ACA83964"/>
+    <w:lvl w:ilvl="0" w:tplc="240A000F">
+      <w:start w:val="1"/>
+      <w:numFmt w:val="decimal"/>
+      <w:lvlText w:val="%1."/>
+      <w:lvlJc w:val="left"/>
+      <w:pPr>
+        <w:ind w:left="720" w:hanging="360"/>
+      </w:pPr>
+    </w:lvl>
+    <w:lvl w:ilvl="1" w:tplc="240A0019">
+      <w:start w:val="1"/>
+      <w:numFmt w:val="lowerLetter"/>
+      <w:lvlText w:val="%2."/>
+      <w:lvlJc w:val="left"/>
+      <w:pPr>
+        <w:ind w:left="1440" w:hanging="360"/>
+      </w:pPr>
+    </w:lvl>
+    <w:lvl w:ilvl="2" w:tplc="240A001B">
+      <w:start w:val="1"/>
+      <w:numFmt w:val="lowerRoman"/>
+      <w:lvlText w:val="%3."/>
+      <w:lvlJc w:val="right"/>
+      <w:pPr>
+        <w:ind w:left="2160" w:hanging="180"/>
+      </w:pPr>
+    </w:lvl>
+    <w:lvl w:ilvl="3" w:tplc="240A000F">
+      <w:start w:val="1"/>
+      <w:numFmt w:val="decimal"/>
+      <w:lvlText w:val="%4."/>
+      <w:lvlJc w:val="left"/>
+      <w:pPr>
+        <w:ind w:left="2880" w:hanging="360"/>
+      </w:pPr>
+    </w:lvl>
+    <w:lvl w:ilvl="4" w:tplc="240A0019">
+      <w:start w:val="1"/>
+      <w:numFmt w:val="lowerLetter"/>
+      <w:lvlText w:val="%5."/>
+      <w:lvlJc w:val="left"/>
+      <w:pPr>
+        <w:ind w:left="3600" w:hanging="360"/>
+      </w:pPr>
+    </w:lvl>
+    <w:lvl w:ilvl="5" w:tplc="240A001B">
+      <w:start w:val="1"/>
+      <w:numFmt w:val="lowerRoman"/>
+      <w:lvlText w:val="%6."/>
+      <w:lvlJc w:val="right"/>
+      <w:pPr>
+        <w:ind w:left="4320" w:hanging="180"/>
+      </w:pPr>
+    </w:lvl>
+    <w:lvl w:ilvl="6" w:tplc="240A000F">
+      <w:start w:val="1"/>
+      <w:numFmt w:val="decimal"/>
+      <w:lvlText w:val="%7."/>
+      <w:lvlJc w:val="left"/>
+      <w:pPr>
+        <w:ind w:left="5040" w:hanging="360"/>
+      </w:pPr>
+    </w:lvl>
+    <w:lvl w:ilvl="7" w:tplc="240A0019">
+      <w:start w:val="1"/>
+      <w:numFmt w:val="lowerLetter"/>
+      <w:lvlText w:val="%8."/>
+      <w:lvlJc w:val="left"/>
+      <w:pPr>
+        <w:ind w:left="5760" w:hanging="360"/>
+      </w:pPr>
+    </w:lvl>
+    <w:lvl w:ilvl="8" w:tplc="240A001B">
+      <w:start w:val="1"/>
+      <w:numFmt w:val="lowerRoman"/>
+      <w:lvlText w:val="%9."/>
+      <w:lvlJc w:val="right"/>
+      <w:pPr>
+        <w:ind w:left="6480" w:hanging="180"/>
+      </w:pPr>
+    </w:lvl>
+  </w:abstractNum>
+  <w:abstractNum w:abstractNumId="3" w15:restartNumberingAfterBreak="0">
+    <w:nsid w:val="503A17FF"/>
+    <w:multiLevelType w:val="hybridMultilevel"/>
+    <w:tmpl w:val="9EACA5FC"/>
+    <w:lvl w:ilvl="0" w:tplc="240A000F">
+      <w:start w:val="1"/>
+      <w:numFmt w:val="decimal"/>
+      <w:lvlText w:val="%1."/>
+      <w:lvlJc w:val="left"/>
+      <w:pPr>
+        <w:ind w:left="720" w:hanging="360"/>
+      </w:pPr>
+    </w:lvl>
+    <w:lvl w:ilvl="1" w:tplc="240A0019">
+      <w:start w:val="1"/>
+      <w:numFmt w:val="lowerLetter"/>
+      <w:lvlText w:val="%2."/>
+      <w:lvlJc w:val="left"/>
+      <w:pPr>
+        <w:ind w:left="1440" w:hanging="360"/>
+      </w:pPr>
+    </w:lvl>
+    <w:lvl w:ilvl="2" w:tplc="240A001B" w:tentative="1">
+      <w:start w:val="1"/>
+      <w:numFmt w:val="lowerRoman"/>
+      <w:lvlText w:val="%3."/>
+      <w:lvlJc w:val="right"/>
+      <w:pPr>
+        <w:ind w:left="2160" w:hanging="180"/>
+      </w:pPr>
+    </w:lvl>
+    <w:lvl w:ilvl="3" w:tplc="240A000F" w:tentative="1">
+      <w:start w:val="1"/>
+      <w:numFmt w:val="decimal"/>
+      <w:lvlText w:val="%4."/>
+      <w:lvlJc w:val="left"/>
+      <w:pPr>
+        <w:ind w:left="2880" w:hanging="360"/>
+      </w:pPr>
+    </w:lvl>
+    <w:lvl w:ilvl="4" w:tplc="240A0019" w:tentative="1">
+      <w:start w:val="1"/>
+      <w:numFmt w:val="lowerLetter"/>
+      <w:lvlText w:val="%5."/>
+      <w:lvlJc w:val="left"/>
+      <w:pPr>
+        <w:ind w:left="3600" w:hanging="360"/>
+      </w:pPr>
+    </w:lvl>
+    <w:lvl w:ilvl="5" w:tplc="240A001B" w:tentative="1">
+      <w:start w:val="1"/>
+      <w:numFmt w:val="lowerRoman"/>
+      <w:lvlText w:val="%6."/>
+      <w:lvlJc w:val="right"/>
+      <w:pPr>
+        <w:ind w:left="4320" w:hanging="180"/>
+      </w:pPr>
+    </w:lvl>
+    <w:lvl w:ilvl="6" w:tplc="240A000F" w:tentative="1">
+      <w:start w:val="1"/>
+      <w:numFmt w:val="decimal"/>
+      <w:lvlText w:val="%7."/>
+      <w:lvlJc w:val="left"/>
+      <w:pPr>
+        <w:ind w:left="5040" w:hanging="360"/>
+      </w:pPr>
+    </w:lvl>
+    <w:lvl w:ilvl="7" w:tplc="240A0019" w:tentative="1">
+      <w:start w:val="1"/>
+      <w:numFmt w:val="lowerLetter"/>
+      <w:lvlText w:val="%8."/>
+      <w:lvlJc w:val="left"/>
+      <w:pPr>
+        <w:ind w:left="5760" w:hanging="360"/>
+      </w:pPr>
+    </w:lvl>
+    <w:lvl w:ilvl="8" w:tplc="240A001B" w:tentative="1">
+      <w:start w:val="1"/>
+      <w:numFmt w:val="lowerRoman"/>
+      <w:lvlText w:val="%9."/>
+      <w:lvlJc w:val="right"/>
+      <w:pPr>
+        <w:ind w:left="6480" w:hanging="180"/>
+      </w:pPr>
+    </w:lvl>
+  </w:abstractNum>
+  <w:abstractNum w:abstractNumId="4" w15:restartNumberingAfterBreak="0">
+    <w:nsid w:val="6B3A576E"/>
+    <w:multiLevelType w:val="hybridMultilevel"/>
+    <w:tmpl w:val="B486EF04"/>
+    <w:lvl w:ilvl="0" w:tplc="240A0001">
+      <w:start w:val="1"/>
+      <w:numFmt w:val="bullet"/>
+      <w:lvlText w:val=""/>
+      <w:lvlJc w:val="left"/>
+      <w:pPr>
+        <w:ind w:left="720" w:hanging="360"/>
+      </w:pPr>
+      <w:rPr>
+        <w:rFonts w:ascii="Symbol" w:hAnsi="Symbol" w:hint="default"/>
+      </w:rPr>
+    </w:lvl>
+    <w:lvl w:ilvl="1" w:tplc="240A0003" w:tentative="1">
+      <w:start w:val="1"/>
+      <w:numFmt w:val="bullet"/>
+      <w:lvlText w:val="o"/>
+      <w:lvlJc w:val="left"/>
+      <w:pPr>
+        <w:ind w:left="1440" w:hanging="360"/>
+      </w:pPr>
+      <w:rPr>
+        <w:rFonts w:ascii="Courier New" w:hAnsi="Courier New" w:cs="Courier New" w:hint="default"/>
+      </w:rPr>
+    </w:lvl>
+    <w:lvl w:ilvl="2" w:tplc="240A0005" w:tentative="1">
+      <w:start w:val="1"/>
+      <w:numFmt w:val="bullet"/>
+      <w:lvlText w:val=""/>
+      <w:lvlJc w:val="left"/>
+      <w:pPr>
+        <w:ind w:left="2160" w:hanging="360"/>
+      </w:pPr>
+      <w:rPr>
+        <w:rFonts w:ascii="Wingdings" w:hAnsi="Wingdings" w:hint="default"/>
+      </w:rPr>
+    </w:lvl>
+    <w:lvl w:ilvl="3" w:tplc="240A0001" w:tentative="1">
+      <w:start w:val="1"/>
+      <w:numFmt w:val="bullet"/>
+      <w:lvlText w:val=""/>
+      <w:lvlJc w:val="left"/>
+      <w:pPr>
+        <w:ind w:left="2880" w:hanging="360"/>
+      </w:pPr>
+      <w:rPr>
+        <w:rFonts w:ascii="Symbol" w:hAnsi="Symbol" w:hint="default"/>
+      </w:rPr>
+    </w:lvl>
+    <w:lvl w:ilvl="4" w:tplc="240A0003" w:tentative="1">
+      <w:start w:val="1"/>
+      <w:numFmt w:val="bullet"/>
+      <w:lvlText w:val="o"/>
+      <w:lvlJc w:val="left"/>
+      <w:pPr>
+        <w:ind w:left="3600" w:hanging="360"/>
+      </w:pPr>
+      <w:rPr>
+        <w:rFonts w:ascii="Courier New" w:hAnsi="Courier New" w:cs="Courier New" w:hint="default"/>
+      </w:rPr>
+    </w:lvl>
+    <w:lvl w:ilvl="5" w:tplc="240A0005" w:tentative="1">
+      <w:start w:val="1"/>
+      <w:numFmt w:val="bullet"/>
+      <w:lvlText w:val=""/>
+      <w:lvlJc w:val="left"/>
+      <w:pPr>
+        <w:ind w:left="4320" w:hanging="360"/>
+      </w:pPr>
+      <w:rPr>
+        <w:rFonts w:ascii="Wingdings" w:hAnsi="Wingdings" w:hint="default"/>
+      </w:rPr>
+    </w:lvl>
+    <w:lvl w:ilvl="6" w:tplc="240A0001" w:tentative="1">
+      <w:start w:val="1"/>
+      <w:numFmt w:val="bullet"/>
+      <w:lvlText w:val=""/>
+      <w:lvlJc w:val="left"/>
+      <w:pPr>
+        <w:ind w:left="5040" w:hanging="360"/>
+      </w:pPr>
+      <w:rPr>
+        <w:rFonts w:ascii="Symbol" w:hAnsi="Symbol" w:hint="default"/>
+      </w:rPr>
+    </w:lvl>
+    <w:lvl w:ilvl="7" w:tplc="240A0003" w:tentative="1">
+      <w:start w:val="1"/>
+      <w:numFmt w:val="bullet"/>
+      <w:lvlText w:val="o"/>
+      <w:lvlJc w:val="left"/>
+      <w:pPr>
+        <w:ind w:left="5760" w:hanging="360"/>
+      </w:pPr>
+      <w:rPr>
+        <w:rFonts w:ascii="Courier New" w:hAnsi="Courier New" w:cs="Courier New" w:hint="default"/>
+      </w:rPr>
+    </w:lvl>
+    <w:lvl w:ilvl="8" w:tplc="240A0005" w:tentative="1">
+      <w:start w:val="1"/>
+      <w:numFmt w:val="bullet"/>
+      <w:lvlText w:val=""/>
+      <w:lvlJc w:val="left"/>
+      <w:pPr>
+        <w:ind w:left="6480" w:hanging="360"/>
+      </w:pPr>
+      <w:rPr>
+        <w:rFonts w:ascii="Wingdings" w:hAnsi="Wingdings" w:hint="default"/>
+      </w:rPr>
+    </w:lvl>
+  </w:abstractNum>
   <w:num w:numId="1" w16cid:durableId="968819108">
     <w:abstractNumId w:val="1"/>
   </w:num>
   <w:num w:numId="2" w16cid:durableId="260070218">
     <w:abstractNumId w:val="0"/>
+  </w:num>
+  <w:num w:numId="3" w16cid:durableId="1517765568">
+    <w:abstractNumId w:val="3"/>
+  </w:num>
+  <w:num w:numId="4" w16cid:durableId="1943953752">
+    <w:abstractNumId w:val="2"/>
+  </w:num>
+  <w:num w:numId="5" w16cid:durableId="1219634197">
+    <w:abstractNumId w:val="4"/>
   </w:num>
 </w:numbering>
 </file>
@@ -2315,4 +2449,16 @@
     </a:ext>
   </a:extLst>
 </a:theme>
+</file>
+
+<file path=customXml/item1.xml><?xml version="1.0" encoding="utf-8"?>
+<b:Sources xmlns:b="http://schemas.openxmlformats.org/officeDocument/2006/bibliography" xmlns="http://schemas.openxmlformats.org/officeDocument/2006/bibliography" SelectedStyle="\APASixthEditionOfficeOnline.xsl" StyleName="APA" Version="6"/>
+</file>
+
+<file path=customXml/itemProps1.xml><?xml version="1.0" encoding="utf-8"?>
+<ds:datastoreItem xmlns:ds="http://schemas.openxmlformats.org/officeDocument/2006/customXml" ds:itemID="{B21E325F-422C-49A1-921C-4B42298483B4}">
+  <ds:schemaRefs>
+    <ds:schemaRef ds:uri="http://schemas.openxmlformats.org/officeDocument/2006/bibliography"/>
+  </ds:schemaRefs>
+</ds:datastoreItem>
 </file>
</xml_diff>

<commit_message>
Mejoras en el apartado de anuncios y estados HTTP
</commit_message>
<xml_diff>
--- a/docs/Mejoras y cambio/Mejoras y cambios.docx
+++ b/docs/Mejoras y cambio/Mejoras y cambios.docx
@@ -598,7 +598,19 @@
         <w:rPr>
           <w:lang w:val="es-MX"/>
         </w:rPr>
-        <w:t>, este debe tener un botón de vista previa, de como se verá en el panel publico.</w:t>
+        <w:t xml:space="preserve">, este debe tener un botón de vista previa, de como se verá en el panel </w:t>
+      </w:r>
+      <w:r>
+        <w:rPr>
+          <w:lang w:val="es-MX"/>
+        </w:rPr>
+        <w:t>público</w:t>
+      </w:r>
+      <w:r>
+        <w:rPr>
+          <w:lang w:val="es-MX"/>
+        </w:rPr>
+        <w:t>.</w:t>
       </w:r>
     </w:p>
     <w:p>

</xml_diff>

<commit_message>
Modulo de anuncio configurado, prodecer con la implementacion del modulo y muro de cumpleaños
</commit_message>
<xml_diff>
--- a/docs/Mejoras y cambio/Mejoras y cambios.docx
+++ b/docs/Mejoras y cambio/Mejoras y cambios.docx
@@ -23,11 +23,6 @@
     </w:p>
     <w:p>
       <w:pPr>
-        <w:pStyle w:val="Prrafodelista"/>
-        <w:numPr>
-          <w:ilvl w:val="0"/>
-          <w:numId w:val="4"/>
-        </w:numPr>
         <w:rPr>
           <w:lang w:val="es-MX"/>
         </w:rPr>
@@ -36,680 +31,260 @@
         <w:rPr>
           <w:lang w:val="es-MX"/>
         </w:rPr>
-        <w:t>Vamos a implementar el módulo de Comunicaciones:</w:t>
+        <w:t>Replica el diseño:</w:t>
       </w:r>
     </w:p>
     <w:p>
       <w:pPr>
-        <w:pStyle w:val="Prrafodelista"/>
-        <w:numPr>
-          <w:ilvl w:val="1"/>
-          <w:numId w:val="4"/>
-        </w:numPr>
         <w:rPr>
           <w:lang w:val="es-MX"/>
         </w:rPr>
       </w:pPr>
       <w:r>
         <w:rPr>
+          <w:noProof/>
           <w:lang w:val="es-MX"/>
         </w:rPr>
-        <w:t>Carpera Usuarios:</w:t>
-      </w:r>
-    </w:p>
-    <w:p>
-      <w:pPr>
-        <w:pStyle w:val="Prrafodelista"/>
-        <w:numPr>
-          <w:ilvl w:val="2"/>
-          <w:numId w:val="4"/>
-        </w:numPr>
-        <w:rPr>
-          <w:lang w:val="es-MX"/>
-        </w:rPr>
-      </w:pPr>
-      <w:r>
-        <w:rPr>
-          <w:lang w:val="es-MX"/>
-        </w:rPr>
-        <w:drawing>
-          <wp:anchor distT="0" distB="0" distL="114300" distR="114300" simplePos="0" relativeHeight="251658240" behindDoc="0" locked="0" layoutInCell="1" allowOverlap="1" wp14:anchorId="46A56521" wp14:editId="60AEBDA7">
-            <wp:simplePos x="0" y="0"/>
-            <wp:positionH relativeFrom="margin">
-              <wp:posOffset>-659130</wp:posOffset>
-            </wp:positionH>
-            <wp:positionV relativeFrom="margin">
-              <wp:posOffset>1016000</wp:posOffset>
-            </wp:positionV>
-            <wp:extent cx="1885950" cy="4451350"/>
-            <wp:effectExtent l="0" t="0" r="0" b="6350"/>
-            <wp:wrapSquare wrapText="bothSides"/>
-            <wp:docPr id="1208824913" name="Imagen 1"/>
-            <wp:cNvGraphicFramePr>
-              <a:graphicFrameLocks xmlns:a="http://schemas.openxmlformats.org/drawingml/2006/main" noChangeAspect="1"/>
-            </wp:cNvGraphicFramePr>
-            <a:graphic xmlns:a="http://schemas.openxmlformats.org/drawingml/2006/main">
-              <a:graphicData uri="http://schemas.openxmlformats.org/drawingml/2006/picture">
-                <pic:pic xmlns:pic="http://schemas.openxmlformats.org/drawingml/2006/picture">
-                  <pic:nvPicPr>
-                    <pic:cNvPr id="1208824913" name=""/>
-                    <pic:cNvPicPr/>
-                  </pic:nvPicPr>
-                  <pic:blipFill>
-                    <a:blip r:embed="rId6">
-                      <a:extLst>
-                        <a:ext uri="{28A0092B-C50C-407E-A947-70E740481C1C}">
-                          <a14:useLocalDpi xmlns:a14="http://schemas.microsoft.com/office/drawing/2010/main" val="0"/>
-                        </a:ext>
-                      </a:extLst>
-                    </a:blip>
-                    <a:stretch>
-                      <a:fillRect/>
-                    </a:stretch>
-                  </pic:blipFill>
-                  <pic:spPr>
-                    <a:xfrm>
-                      <a:off x="0" y="0"/>
-                      <a:ext cx="1885950" cy="4451350"/>
-                    </a:xfrm>
-                    <a:prstGeom prst="rect">
-                      <a:avLst/>
-                    </a:prstGeom>
-                  </pic:spPr>
-                </pic:pic>
-              </a:graphicData>
-            </a:graphic>
-            <wp14:sizeRelV relativeFrom="margin">
-              <wp14:pctHeight>0</wp14:pctHeight>
-            </wp14:sizeRelV>
-          </wp:anchor>
-        </w:drawing>
-      </w:r>
-      <w:r>
-        <w:rPr>
-          <w:lang w:val="es-MX"/>
-        </w:rPr>
-        <w:drawing>
-          <wp:anchor distT="0" distB="0" distL="114300" distR="114300" simplePos="0" relativeHeight="251660288" behindDoc="0" locked="0" layoutInCell="1" allowOverlap="1" wp14:anchorId="51A37066" wp14:editId="61C2D030">
-            <wp:simplePos x="0" y="0"/>
-            <wp:positionH relativeFrom="margin">
-              <wp:posOffset>1320800</wp:posOffset>
-            </wp:positionH>
-            <wp:positionV relativeFrom="margin">
-              <wp:posOffset>3648075</wp:posOffset>
-            </wp:positionV>
-            <wp:extent cx="5238115" cy="1804035"/>
-            <wp:effectExtent l="0" t="0" r="635" b="5715"/>
-            <wp:wrapSquare wrapText="bothSides"/>
-            <wp:docPr id="1634916245" name="Imagen 1"/>
-            <wp:cNvGraphicFramePr>
-              <a:graphicFrameLocks xmlns:a="http://schemas.openxmlformats.org/drawingml/2006/main" noChangeAspect="1"/>
-            </wp:cNvGraphicFramePr>
-            <a:graphic xmlns:a="http://schemas.openxmlformats.org/drawingml/2006/main">
-              <a:graphicData uri="http://schemas.openxmlformats.org/drawingml/2006/picture">
-                <pic:pic xmlns:pic="http://schemas.openxmlformats.org/drawingml/2006/picture">
-                  <pic:nvPicPr>
-                    <pic:cNvPr id="1634916245" name=""/>
-                    <pic:cNvPicPr/>
-                  </pic:nvPicPr>
-                  <pic:blipFill>
-                    <a:blip r:embed="rId7" cstate="print">
-                      <a:extLst>
-                        <a:ext uri="{28A0092B-C50C-407E-A947-70E740481C1C}">
-                          <a14:useLocalDpi xmlns:a14="http://schemas.microsoft.com/office/drawing/2010/main" val="0"/>
-                        </a:ext>
-                      </a:extLst>
-                    </a:blip>
-                    <a:stretch>
-                      <a:fillRect/>
-                    </a:stretch>
-                  </pic:blipFill>
-                  <pic:spPr>
-                    <a:xfrm>
-                      <a:off x="0" y="0"/>
-                      <a:ext cx="5238115" cy="1804035"/>
-                    </a:xfrm>
-                    <a:prstGeom prst="rect">
-                      <a:avLst/>
-                    </a:prstGeom>
-                  </pic:spPr>
-                </pic:pic>
-              </a:graphicData>
-            </a:graphic>
-            <wp14:sizeRelH relativeFrom="margin">
-              <wp14:pctWidth>0</wp14:pctWidth>
-            </wp14:sizeRelH>
-          </wp:anchor>
-        </w:drawing>
-      </w:r>
-      <w:r>
-        <w:rPr>
-          <w:lang w:val="es-MX"/>
-        </w:rPr>
-        <w:drawing>
-          <wp:anchor distT="0" distB="0" distL="114300" distR="114300" simplePos="0" relativeHeight="251659264" behindDoc="0" locked="0" layoutInCell="1" allowOverlap="1" wp14:anchorId="5247A9A8" wp14:editId="01C0EFF9">
-            <wp:simplePos x="0" y="0"/>
-            <wp:positionH relativeFrom="margin">
-              <wp:posOffset>1320634</wp:posOffset>
-            </wp:positionH>
-            <wp:positionV relativeFrom="margin">
-              <wp:posOffset>1405918</wp:posOffset>
-            </wp:positionV>
-            <wp:extent cx="5238115" cy="2164715"/>
-            <wp:effectExtent l="0" t="0" r="635" b="6985"/>
-            <wp:wrapSquare wrapText="bothSides"/>
-            <wp:docPr id="460203131" name="Imagen 1"/>
-            <wp:cNvGraphicFramePr>
-              <a:graphicFrameLocks xmlns:a="http://schemas.openxmlformats.org/drawingml/2006/main" noChangeAspect="1"/>
-            </wp:cNvGraphicFramePr>
-            <a:graphic xmlns:a="http://schemas.openxmlformats.org/drawingml/2006/main">
-              <a:graphicData uri="http://schemas.openxmlformats.org/drawingml/2006/picture">
-                <pic:pic xmlns:pic="http://schemas.openxmlformats.org/drawingml/2006/picture">
-                  <pic:nvPicPr>
-                    <pic:cNvPr id="460203131" name=""/>
-                    <pic:cNvPicPr/>
-                  </pic:nvPicPr>
-                  <pic:blipFill>
-                    <a:blip r:embed="rId8" cstate="print">
-                      <a:extLst>
-                        <a:ext uri="{28A0092B-C50C-407E-A947-70E740481C1C}">
-                          <a14:useLocalDpi xmlns:a14="http://schemas.microsoft.com/office/drawing/2010/main" val="0"/>
-                        </a:ext>
-                      </a:extLst>
-                    </a:blip>
-                    <a:stretch>
-                      <a:fillRect/>
-                    </a:stretch>
-                  </pic:blipFill>
-                  <pic:spPr>
-                    <a:xfrm>
-                      <a:off x="0" y="0"/>
-                      <a:ext cx="5238115" cy="2164715"/>
-                    </a:xfrm>
-                    <a:prstGeom prst="rect">
-                      <a:avLst/>
-                    </a:prstGeom>
-                  </pic:spPr>
-                </pic:pic>
-              </a:graphicData>
-            </a:graphic>
-            <wp14:sizeRelH relativeFrom="margin">
-              <wp14:pctWidth>0</wp14:pctWidth>
-            </wp14:sizeRelH>
-          </wp:anchor>
-        </w:drawing>
-      </w:r>
-      <w:r>
-        <w:rPr>
-          <w:lang w:val="es-MX"/>
-        </w:rPr>
-        <w:t>Usuarios:</w:t>
-      </w:r>
-      <w:r>
-        <w:rPr>
-          <w:lang w:val="es-MX"/>
-        </w:rPr>
-        <w:br/>
-        <w:t>En este módulo Solo aparecerán todos los usuarios con el cargo comunicaciones que se crean en el módulo de Generales.</w:t>
-      </w:r>
-    </w:p>
-    <w:p>
-      <w:pPr>
-        <w:pStyle w:val="Prrafodelista"/>
-        <w:numPr>
-          <w:ilvl w:val="2"/>
-          <w:numId w:val="4"/>
-        </w:numPr>
-        <w:rPr>
-          <w:lang w:val="es-MX"/>
-        </w:rPr>
-      </w:pPr>
-      <w:r>
-        <w:rPr>
-          <w:lang w:val="es-MX"/>
-        </w:rPr>
-        <w:t>Permisos:</w:t>
-      </w:r>
-    </w:p>
-    <w:p>
-      <w:pPr>
-        <w:pStyle w:val="Prrafodelista"/>
-        <w:ind w:left="2160"/>
-        <w:rPr>
-          <w:lang w:val="es-MX"/>
-        </w:rPr>
-      </w:pPr>
-      <w:r>
-        <w:rPr>
-          <w:lang w:val="es-MX"/>
-        </w:rPr>
-        <w:t xml:space="preserve">En este módulo de darán acceso a realizar acciones dentro de cada submódulo del módulo de Comunicaciones, acciones tales como dar acceso a otorgar permisos, gestión de anuncios, </w:t>
-      </w:r>
-      <w:r>
-        <w:rPr>
-          <w:lang w:val="es-MX"/>
-        </w:rPr>
-        <w:t>gestión de calendarios, gestión de logros y acreditaciones, y tareas y seguimiento.</w:t>
-      </w:r>
-    </w:p>
-    <w:p>
-      <w:pPr>
-        <w:rPr>
-          <w:lang w:val="es-MX"/>
-        </w:rPr>
-      </w:pPr>
-      <w:r>
-        <w:rPr>
-          <w:lang w:val="es-MX"/>
-        </w:rPr>
-        <w:drawing>
-          <wp:inline distT="0" distB="0" distL="0" distR="0" wp14:anchorId="7F56B096" wp14:editId="504A22CF">
-            <wp:extent cx="5612130" cy="1233170"/>
-            <wp:effectExtent l="0" t="0" r="7620" b="5080"/>
-            <wp:docPr id="5429122" name="Imagen 1"/>
-            <wp:cNvGraphicFramePr>
-              <a:graphicFrameLocks xmlns:a="http://schemas.openxmlformats.org/drawingml/2006/main" noChangeAspect="1"/>
-            </wp:cNvGraphicFramePr>
-            <a:graphic xmlns:a="http://schemas.openxmlformats.org/drawingml/2006/main">
-              <a:graphicData uri="http://schemas.openxmlformats.org/drawingml/2006/picture">
-                <pic:pic xmlns:pic="http://schemas.openxmlformats.org/drawingml/2006/picture">
-                  <pic:nvPicPr>
-                    <pic:cNvPr id="5429122" name=""/>
-                    <pic:cNvPicPr/>
-                  </pic:nvPicPr>
-                  <pic:blipFill>
-                    <a:blip r:embed="rId9"/>
-                    <a:stretch>
-                      <a:fillRect/>
-                    </a:stretch>
-                  </pic:blipFill>
-                  <pic:spPr>
-                    <a:xfrm>
-                      <a:off x="0" y="0"/>
-                      <a:ext cx="5612130" cy="1233170"/>
-                    </a:xfrm>
-                    <a:prstGeom prst="rect">
-                      <a:avLst/>
-                    </a:prstGeom>
-                  </pic:spPr>
-                </pic:pic>
-              </a:graphicData>
-            </a:graphic>
-          </wp:inline>
-        </w:drawing>
-      </w:r>
-    </w:p>
-    <w:p>
-      <w:pPr>
-        <w:rPr>
-          <w:lang w:val="es-MX"/>
-        </w:rPr>
-      </w:pPr>
-      <w:r>
-        <w:rPr>
-          <w:lang w:val="es-MX"/>
-        </w:rPr>
-        <w:lastRenderedPageBreak/>
-        <w:t xml:space="preserve">Este </w:t>
-      </w:r>
-      <w:r>
-        <w:rPr>
-          <w:lang w:val="es-MX"/>
-        </w:rPr>
-        <w:t>módulo</w:t>
-      </w:r>
-      <w:r>
-        <w:rPr>
-          <w:lang w:val="es-MX"/>
-        </w:rPr>
-        <w:t xml:space="preserve"> </w:t>
-      </w:r>
-      <w:r>
-        <w:rPr>
-          <w:lang w:val="es-MX"/>
-        </w:rPr>
-        <w:t>funcionará</w:t>
-      </w:r>
-      <w:r>
-        <w:rPr>
-          <w:lang w:val="es-MX"/>
-        </w:rPr>
-        <w:t xml:space="preserve"> de la siguiente manera; </w:t>
-      </w:r>
-      <w:r>
-        <w:rPr>
-          <w:lang w:val="es-MX"/>
-        </w:rPr>
-        <w:t>tendrá</w:t>
-      </w:r>
-      <w:r>
-        <w:rPr>
-          <w:lang w:val="es-MX"/>
-        </w:rPr>
-        <w:t xml:space="preserve"> la misma apariencia </w:t>
-      </w:r>
-    </w:p>
-    <w:p>
-      <w:pPr>
-        <w:rPr>
-          <w:lang w:val="es-MX"/>
-        </w:rPr>
-      </w:pPr>
-      <w:r>
-        <w:rPr>
-          <w:lang w:val="es-MX"/>
-        </w:rPr>
-        <w:drawing>
-          <wp:inline distT="0" distB="0" distL="0" distR="0" wp14:anchorId="2830F30F" wp14:editId="579036ED">
-            <wp:extent cx="5612130" cy="2219960"/>
-            <wp:effectExtent l="0" t="0" r="7620" b="8890"/>
-            <wp:docPr id="1250553501" name="Imagen 1"/>
-            <wp:cNvGraphicFramePr>
-              <a:graphicFrameLocks xmlns:a="http://schemas.openxmlformats.org/drawingml/2006/main" noChangeAspect="1"/>
-            </wp:cNvGraphicFramePr>
-            <a:graphic xmlns:a="http://schemas.openxmlformats.org/drawingml/2006/main">
-              <a:graphicData uri="http://schemas.openxmlformats.org/drawingml/2006/picture">
-                <pic:pic xmlns:pic="http://schemas.openxmlformats.org/drawingml/2006/picture">
-                  <pic:nvPicPr>
-                    <pic:cNvPr id="1250553501" name=""/>
-                    <pic:cNvPicPr/>
-                  </pic:nvPicPr>
-                  <pic:blipFill>
-                    <a:blip r:embed="rId10"/>
-                    <a:stretch>
-                      <a:fillRect/>
-                    </a:stretch>
-                  </pic:blipFill>
-                  <pic:spPr>
-                    <a:xfrm>
-                      <a:off x="0" y="0"/>
-                      <a:ext cx="5612130" cy="2219960"/>
-                    </a:xfrm>
-                    <a:prstGeom prst="rect">
-                      <a:avLst/>
-                    </a:prstGeom>
-                  </pic:spPr>
-                </pic:pic>
-              </a:graphicData>
-            </a:graphic>
-          </wp:inline>
-        </w:drawing>
-      </w:r>
-    </w:p>
-    <w:p>
-      <w:pPr>
-        <w:rPr>
-          <w:lang w:val="es-MX"/>
-        </w:rPr>
-      </w:pPr>
-      <w:r>
-        <w:rPr>
-          <w:lang w:val="es-MX"/>
-        </w:rPr>
-        <w:t>Donde aparecerán cada módulo y submódulo del panel administrador de las comunicaciones, por ahora hazlo con esta apariencia, después lo pondremos con esta función, pero que tenga los referentes al módulo de comunicaciones.</w:t>
-      </w:r>
-    </w:p>
-    <w:p>
-      <w:pPr>
-        <w:pStyle w:val="Prrafodelista"/>
-        <w:numPr>
-          <w:ilvl w:val="1"/>
-          <w:numId w:val="4"/>
-        </w:numPr>
-        <w:rPr>
-          <w:lang w:val="es-MX"/>
-        </w:rPr>
-      </w:pPr>
-      <w:r>
-        <w:rPr>
-          <w:lang w:val="es-MX"/>
-        </w:rPr>
-        <w:t>Carpeta Anuncios:</w:t>
-      </w:r>
-    </w:p>
-    <w:p>
-      <w:pPr>
-        <w:pStyle w:val="Prrafodelista"/>
-        <w:numPr>
-          <w:ilvl w:val="2"/>
-          <w:numId w:val="4"/>
-        </w:numPr>
-        <w:rPr>
-          <w:lang w:val="es-MX"/>
-        </w:rPr>
-      </w:pPr>
-      <w:r>
-        <w:rPr>
-          <w:lang w:val="es-MX"/>
-        </w:rPr>
-        <w:t>Crear anuncio:</w:t>
-      </w:r>
-    </w:p>
-    <w:p>
-      <w:pPr>
-        <w:pStyle w:val="Prrafodelista"/>
-        <w:ind w:left="2160"/>
-        <w:rPr>
-          <w:lang w:val="es-MX"/>
-        </w:rPr>
-      </w:pPr>
-      <w:r>
-        <w:rPr>
-          <w:lang w:val="es-MX"/>
-        </w:rPr>
-        <w:t>este crea una tabla donde aparezcan todos los anuncios, y arriba aparezca un botón que se llame “Crear Anuncio” y de desplegué un modal con los datos a solicitar para el registro, quita la opción de “Publicar automáticamente al crear”.</w:t>
-      </w:r>
-    </w:p>
-    <w:p>
-      <w:pPr>
-        <w:rPr>
-          <w:lang w:val="es-MX"/>
-        </w:rPr>
-      </w:pPr>
-      <w:r>
-        <w:rPr>
-          <w:lang w:val="es-MX"/>
-        </w:rPr>
-        <w:drawing>
-          <wp:inline distT="0" distB="0" distL="0" distR="0" wp14:anchorId="4D9B0325" wp14:editId="05E2EE57">
-            <wp:extent cx="5612130" cy="2794000"/>
-            <wp:effectExtent l="0" t="0" r="7620" b="6350"/>
-            <wp:docPr id="486303566" name="Imagen 1"/>
-            <wp:cNvGraphicFramePr>
-              <a:graphicFrameLocks xmlns:a="http://schemas.openxmlformats.org/drawingml/2006/main" noChangeAspect="1"/>
-            </wp:cNvGraphicFramePr>
-            <a:graphic xmlns:a="http://schemas.openxmlformats.org/drawingml/2006/main">
-              <a:graphicData uri="http://schemas.openxmlformats.org/drawingml/2006/picture">
-                <pic:pic xmlns:pic="http://schemas.openxmlformats.org/drawingml/2006/picture">
-                  <pic:nvPicPr>
-                    <pic:cNvPr id="486303566" name=""/>
-                    <pic:cNvPicPr/>
-                  </pic:nvPicPr>
-                  <pic:blipFill>
-                    <a:blip r:embed="rId11"/>
-                    <a:stretch>
-                      <a:fillRect/>
-                    </a:stretch>
-                  </pic:blipFill>
-                  <pic:spPr>
-                    <a:xfrm>
-                      <a:off x="0" y="0"/>
-                      <a:ext cx="5612130" cy="2794000"/>
-                    </a:xfrm>
-                    <a:prstGeom prst="rect">
-                      <a:avLst/>
-                    </a:prstGeom>
-                  </pic:spPr>
-                </pic:pic>
-              </a:graphicData>
-            </a:graphic>
-          </wp:inline>
-        </w:drawing>
-      </w:r>
-    </w:p>
-    <w:p>
-      <w:pPr>
-        <w:rPr>
-          <w:lang w:val="es-MX"/>
-        </w:rPr>
-      </w:pPr>
-    </w:p>
-    <w:p>
-      <w:pPr>
-        <w:rPr>
-          <w:lang w:val="es-MX"/>
-        </w:rPr>
-      </w:pPr>
-    </w:p>
-    <w:p>
-      <w:pPr>
-        <w:pStyle w:val="Prrafodelista"/>
-        <w:numPr>
-          <w:ilvl w:val="2"/>
-          <w:numId w:val="4"/>
-        </w:numPr>
-        <w:rPr>
-          <w:lang w:val="es-MX"/>
-        </w:rPr>
-      </w:pPr>
-      <w:r>
-        <w:rPr>
-          <w:lang w:val="es-MX"/>
-        </w:rPr>
-        <w:lastRenderedPageBreak/>
-        <w:t>Calendario de Anuncios:</w:t>
-      </w:r>
-    </w:p>
-    <w:p>
-      <w:pPr>
-        <w:pStyle w:val="Prrafodelista"/>
-        <w:ind w:left="2160"/>
-        <w:rPr>
-          <w:lang w:val="es-MX"/>
-        </w:rPr>
-      </w:pPr>
-      <w:r>
-        <w:rPr>
-          <w:lang w:val="es-MX"/>
-        </w:rPr>
-        <w:t>Todos los anuncios que se registren deben de aparecer en una lista debajo de los dos espacios que son el calendario y la tabla que esta al lado, con los anuncios próximos a cargar en el panel de anuncios</w:t>
-      </w:r>
-      <w:r>
-        <w:rPr>
-          <w:lang w:val="es-MX"/>
-        </w:rPr>
-        <w:t xml:space="preserve">, este debe tener un botón de vista previa, de como se verá en el panel </w:t>
-      </w:r>
-      <w:r>
-        <w:rPr>
-          <w:lang w:val="es-MX"/>
-        </w:rPr>
-        <w:t>público</w:t>
-      </w:r>
-      <w:r>
-        <w:rPr>
-          <w:lang w:val="es-MX"/>
-        </w:rPr>
-        <w:t>.</w:t>
-      </w:r>
-    </w:p>
-    <w:p>
-      <w:pPr>
-        <w:rPr>
-          <w:lang w:val="es-MX"/>
-        </w:rPr>
-      </w:pPr>
-      <w:r>
-        <w:rPr>
-          <w:lang w:val="es-MX"/>
-        </w:rPr>
-        <w:drawing>
-          <wp:inline distT="0" distB="0" distL="0" distR="0" wp14:anchorId="1CA2DCFC" wp14:editId="11B10C38">
-            <wp:extent cx="5612130" cy="2788285"/>
-            <wp:effectExtent l="0" t="0" r="7620" b="0"/>
-            <wp:docPr id="710734507" name="Imagen 1"/>
-            <wp:cNvGraphicFramePr>
-              <a:graphicFrameLocks xmlns:a="http://schemas.openxmlformats.org/drawingml/2006/main" noChangeAspect="1"/>
-            </wp:cNvGraphicFramePr>
-            <a:graphic xmlns:a="http://schemas.openxmlformats.org/drawingml/2006/main">
-              <a:graphicData uri="http://schemas.openxmlformats.org/drawingml/2006/picture">
-                <pic:pic xmlns:pic="http://schemas.openxmlformats.org/drawingml/2006/picture">
-                  <pic:nvPicPr>
-                    <pic:cNvPr id="710734507" name=""/>
-                    <pic:cNvPicPr/>
-                  </pic:nvPicPr>
-                  <pic:blipFill>
-                    <a:blip r:embed="rId12"/>
-                    <a:stretch>
-                      <a:fillRect/>
-                    </a:stretch>
-                  </pic:blipFill>
-                  <pic:spPr>
-                    <a:xfrm>
-                      <a:off x="0" y="0"/>
-                      <a:ext cx="5612130" cy="2788285"/>
-                    </a:xfrm>
-                    <a:prstGeom prst="rect">
-                      <a:avLst/>
-                    </a:prstGeom>
-                  </pic:spPr>
-                </pic:pic>
-              </a:graphicData>
-            </a:graphic>
-          </wp:inline>
-        </w:drawing>
-      </w:r>
-    </w:p>
-    <w:p>
-      <w:pPr>
-        <w:rPr>
-          <w:lang w:val="es-MX"/>
-        </w:rPr>
-      </w:pPr>
-      <w:r>
-        <w:rPr>
-          <w:lang w:val="es-MX"/>
-        </w:rPr>
-        <w:drawing>
-          <wp:inline distT="0" distB="0" distL="0" distR="0" wp14:anchorId="413CD11C" wp14:editId="6058DADE">
-            <wp:extent cx="5612130" cy="2792730"/>
-            <wp:effectExtent l="0" t="0" r="7620" b="7620"/>
-            <wp:docPr id="1492504364" name="Imagen 1"/>
-            <wp:cNvGraphicFramePr>
-              <a:graphicFrameLocks xmlns:a="http://schemas.openxmlformats.org/drawingml/2006/main" noChangeAspect="1"/>
-            </wp:cNvGraphicFramePr>
-            <a:graphic xmlns:a="http://schemas.openxmlformats.org/drawingml/2006/main">
-              <a:graphicData uri="http://schemas.openxmlformats.org/drawingml/2006/picture">
-                <pic:pic xmlns:pic="http://schemas.openxmlformats.org/drawingml/2006/picture">
-                  <pic:nvPicPr>
-                    <pic:cNvPr id="1492504364" name=""/>
-                    <pic:cNvPicPr/>
-                  </pic:nvPicPr>
-                  <pic:blipFill>
-                    <a:blip r:embed="rId13"/>
-                    <a:stretch>
-                      <a:fillRect/>
-                    </a:stretch>
-                  </pic:blipFill>
-                  <pic:spPr>
-                    <a:xfrm>
-                      <a:off x="0" y="0"/>
-                      <a:ext cx="5612130" cy="2792730"/>
-                    </a:xfrm>
-                    <a:prstGeom prst="rect">
-                      <a:avLst/>
-                    </a:prstGeom>
-                  </pic:spPr>
-                </pic:pic>
-              </a:graphicData>
-            </a:graphic>
-          </wp:inline>
-        </w:drawing>
+        <mc:AlternateContent>
+          <mc:Choice Requires="wpg">
+            <w:drawing>
+              <wp:anchor distT="0" distB="0" distL="114300" distR="114300" simplePos="0" relativeHeight="251663360" behindDoc="0" locked="0" layoutInCell="1" allowOverlap="1" wp14:anchorId="4A383AB2" wp14:editId="79AE2C66">
+                <wp:simplePos x="0" y="0"/>
+                <wp:positionH relativeFrom="column">
+                  <wp:posOffset>-614045</wp:posOffset>
+                </wp:positionH>
+                <wp:positionV relativeFrom="paragraph">
+                  <wp:posOffset>201295</wp:posOffset>
+                </wp:positionV>
+                <wp:extent cx="9558655" cy="4761865"/>
+                <wp:effectExtent l="0" t="0" r="4445" b="635"/>
+                <wp:wrapSquare wrapText="bothSides"/>
+                <wp:docPr id="618777884" name="Grupo 2"/>
+                <wp:cNvGraphicFramePr/>
+                <a:graphic xmlns:a="http://schemas.openxmlformats.org/drawingml/2006/main">
+                  <a:graphicData uri="http://schemas.microsoft.com/office/word/2010/wordprocessingGroup">
+                    <wpg:wgp>
+                      <wpg:cNvGrpSpPr/>
+                      <wpg:grpSpPr>
+                        <a:xfrm>
+                          <a:off x="0" y="0"/>
+                          <a:ext cx="9558655" cy="4761865"/>
+                          <a:chOff x="0" y="0"/>
+                          <a:chExt cx="9558655" cy="4762373"/>
+                        </a:xfrm>
+                      </wpg:grpSpPr>
+                      <wpg:grpSp>
+                        <wpg:cNvPr id="235156360" name="Grupo 1"/>
+                        <wpg:cNvGrpSpPr/>
+                        <wpg:grpSpPr>
+                          <a:xfrm>
+                            <a:off x="0" y="0"/>
+                            <a:ext cx="9558655" cy="4762373"/>
+                            <a:chOff x="0" y="0"/>
+                            <a:chExt cx="9558655" cy="4762373"/>
+                          </a:xfrm>
+                        </wpg:grpSpPr>
+                        <pic:pic xmlns:pic="http://schemas.openxmlformats.org/drawingml/2006/picture">
+                          <pic:nvPicPr>
+                            <pic:cNvPr id="935748141" name="Imagen 1"/>
+                            <pic:cNvPicPr>
+                              <a:picLocks noChangeAspect="1"/>
+                            </pic:cNvPicPr>
+                          </pic:nvPicPr>
+                          <pic:blipFill>
+                            <a:blip r:embed="rId6">
+                              <a:extLst>
+                                <a:ext uri="{28A0092B-C50C-407E-A947-70E740481C1C}">
+                                  <a14:useLocalDpi xmlns:a14="http://schemas.microsoft.com/office/drawing/2010/main" val="0"/>
+                                </a:ext>
+                              </a:extLst>
+                            </a:blip>
+                            <a:stretch>
+                              <a:fillRect/>
+                            </a:stretch>
+                          </pic:blipFill>
+                          <pic:spPr>
+                            <a:xfrm>
+                              <a:off x="0" y="0"/>
+                              <a:ext cx="9558655" cy="4751070"/>
+                            </a:xfrm>
+                            <a:prstGeom prst="rect">
+                              <a:avLst/>
+                            </a:prstGeom>
+                          </pic:spPr>
+                        </pic:pic>
+                        <pic:pic xmlns:pic="http://schemas.openxmlformats.org/drawingml/2006/picture">
+                          <pic:nvPicPr>
+                            <pic:cNvPr id="1993084587" name="Imagen 1"/>
+                            <pic:cNvPicPr>
+                              <a:picLocks noChangeAspect="1"/>
+                            </pic:cNvPicPr>
+                          </pic:nvPicPr>
+                          <pic:blipFill>
+                            <a:blip r:embed="rId7">
+                              <a:extLst>
+                                <a:ext uri="{28A0092B-C50C-407E-A947-70E740481C1C}">
+                                  <a14:useLocalDpi xmlns:a14="http://schemas.microsoft.com/office/drawing/2010/main" val="0"/>
+                                </a:ext>
+                              </a:extLst>
+                            </a:blip>
+                            <a:stretch>
+                              <a:fillRect/>
+                            </a:stretch>
+                          </pic:blipFill>
+                          <pic:spPr>
+                            <a:xfrm>
+                              <a:off x="14630" y="658368"/>
+                              <a:ext cx="9479915" cy="4104005"/>
+                            </a:xfrm>
+                            <a:prstGeom prst="rect">
+                              <a:avLst/>
+                            </a:prstGeom>
+                          </pic:spPr>
+                        </pic:pic>
+                      </wpg:grpSp>
+                      <pic:pic xmlns:pic="http://schemas.openxmlformats.org/drawingml/2006/picture">
+                        <pic:nvPicPr>
+                          <pic:cNvPr id="1308897970" name="Imagen 1"/>
+                          <pic:cNvPicPr>
+                            <a:picLocks noChangeAspect="1"/>
+                          </pic:cNvPicPr>
+                        </pic:nvPicPr>
+                        <pic:blipFill>
+                          <a:blip r:embed="rId8">
+                            <a:extLst>
+                              <a:ext uri="{28A0092B-C50C-407E-A947-70E740481C1C}">
+                                <a14:useLocalDpi xmlns:a14="http://schemas.microsoft.com/office/drawing/2010/main" val="0"/>
+                              </a:ext>
+                            </a:extLst>
+                          </a:blip>
+                          <a:stretch>
+                            <a:fillRect/>
+                          </a:stretch>
+                        </pic:blipFill>
+                        <pic:spPr>
+                          <a:xfrm>
+                            <a:off x="6971385" y="826617"/>
+                            <a:ext cx="1713865" cy="2064385"/>
+                          </a:xfrm>
+                          <a:prstGeom prst="rect">
+                            <a:avLst/>
+                          </a:prstGeom>
+                        </pic:spPr>
+                      </pic:pic>
+                      <pic:pic xmlns:pic="http://schemas.openxmlformats.org/drawingml/2006/picture">
+                        <pic:nvPicPr>
+                          <pic:cNvPr id="1601682984" name="Imagen 1"/>
+                          <pic:cNvPicPr>
+                            <a:picLocks noChangeAspect="1"/>
+                          </pic:cNvPicPr>
+                        </pic:nvPicPr>
+                        <pic:blipFill>
+                          <a:blip r:embed="rId9">
+                            <a:extLst>
+                              <a:ext uri="{28A0092B-C50C-407E-A947-70E740481C1C}">
+                                <a14:useLocalDpi xmlns:a14="http://schemas.microsoft.com/office/drawing/2010/main" val="0"/>
+                              </a:ext>
+                            </a:extLst>
+                          </a:blip>
+                          <a:stretch>
+                            <a:fillRect/>
+                          </a:stretch>
+                        </pic:blipFill>
+                        <pic:spPr>
+                          <a:xfrm>
+                            <a:off x="2077517" y="797356"/>
+                            <a:ext cx="4703445" cy="971550"/>
+                          </a:xfrm>
+                          <a:prstGeom prst="rect">
+                            <a:avLst/>
+                          </a:prstGeom>
+                        </pic:spPr>
+                      </pic:pic>
+                      <pic:pic xmlns:pic="http://schemas.openxmlformats.org/drawingml/2006/picture">
+                        <pic:nvPicPr>
+                          <pic:cNvPr id="718069584" name="Imagen 1"/>
+                          <pic:cNvPicPr>
+                            <a:picLocks noChangeAspect="1"/>
+                          </pic:cNvPicPr>
+                        </pic:nvPicPr>
+                        <pic:blipFill>
+                          <a:blip r:embed="rId10">
+                            <a:extLst>
+                              <a:ext uri="{28A0092B-C50C-407E-A947-70E740481C1C}">
+                                <a14:useLocalDpi xmlns:a14="http://schemas.microsoft.com/office/drawing/2010/main" val="0"/>
+                              </a:ext>
+                            </a:extLst>
+                          </a:blip>
+                          <a:stretch>
+                            <a:fillRect/>
+                          </a:stretch>
+                        </pic:blipFill>
+                        <pic:spPr>
+                          <a:xfrm>
+                            <a:off x="343814" y="826617"/>
+                            <a:ext cx="1625600" cy="2971165"/>
+                          </a:xfrm>
+                          <a:prstGeom prst="rect">
+                            <a:avLst/>
+                          </a:prstGeom>
+                        </pic:spPr>
+                      </pic:pic>
+                    </wpg:wgp>
+                  </a:graphicData>
+                </a:graphic>
+              </wp:anchor>
+            </w:drawing>
+          </mc:Choice>
+          <mc:Fallback>
+            <w:pict>
+              <v:group w14:anchorId="5A5C3099" id="Grupo 2" o:spid="_x0000_s1026" style="position:absolute;margin-left:-48.35pt;margin-top:15.85pt;width:752.65pt;height:374.95pt;z-index:251663360" coordsize="95586,47623" o:gfxdata="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">
+                <v:group id="Grupo 1" o:spid="_x0000_s1027" style="position:absolute;width:95586;height:47623" coordsize="95586,47623" o:gfxdata="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">
+                  <v:shapetype id="_x0000_t75" coordsize="21600,21600" o:spt="75" o:preferrelative="t" path="m@4@5l@4@11@9@11@9@5xe" filled="f" stroked="f">
+                    <v:stroke joinstyle="miter"/>
+                    <v:formulas>
+                      <v:f eqn="if lineDrawn pixelLineWidth 0"/>
+                      <v:f eqn="sum @0 1 0"/>
+                      <v:f eqn="sum 0 0 @1"/>
+                      <v:f eqn="prod @2 1 2"/>
+                      <v:f eqn="prod @3 21600 pixelWidth"/>
+                      <v:f eqn="prod @3 21600 pixelHeight"/>
+                      <v:f eqn="sum @0 0 1"/>
+                      <v:f eqn="prod @6 1 2"/>
+                      <v:f eqn="prod @7 21600 pixelWidth"/>
+                      <v:f eqn="sum @8 21600 0"/>
+                      <v:f eqn="prod @7 21600 pixelHeight"/>
+                      <v:f eqn="sum @10 21600 0"/>
+                    </v:formulas>
+                    <v:path o:extrusionok="f" gradientshapeok="t" o:connecttype="rect"/>
+                    <o:lock v:ext="edit" aspectratio="t"/>
+                  </v:shapetype>
+                  <v:shape id="Imagen 1" o:spid="_x0000_s1028" type="#_x0000_t75" style="position:absolute;width:95586;height:47510;visibility:visible;mso-wrap-style:square" o:gfxdata="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">
+                    <v:imagedata r:id="rId11" o:title=""/>
+                  </v:shape>
+                  <v:shape id="Imagen 1" o:spid="_x0000_s1029" type="#_x0000_t75" style="position:absolute;left:146;top:6583;width:94799;height:41040;visibility:visible;mso-wrap-style:square" o:gfxdata="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">
+                    <v:imagedata r:id="rId12" o:title=""/>
+                  </v:shape>
+                </v:group>
+                <v:shape id="Imagen 1" o:spid="_x0000_s1030" type="#_x0000_t75" style="position:absolute;left:69713;top:8266;width:17139;height:20644;visibility:visible;mso-wrap-style:square" o:gfxdata="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">
+                  <v:imagedata r:id="rId13" o:title=""/>
+                </v:shape>
+                <v:shape id="Imagen 1" o:spid="_x0000_s1031" type="#_x0000_t75" style="position:absolute;left:20775;top:7973;width:47034;height:9716;visibility:visible;mso-wrap-style:square" o:gfxdata="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">
+                  <v:imagedata r:id="rId14" o:title=""/>
+                </v:shape>
+                <v:shape id="Imagen 1" o:spid="_x0000_s1032" type="#_x0000_t75" style="position:absolute;left:3438;top:8266;width:16256;height:29711;visibility:visible;mso-wrap-style:square" o:gfxdata="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">
+                  <v:imagedata r:id="rId15" o:title=""/>
+                </v:shape>
+                <w10:wrap type="square"/>
+              </v:group>
+            </w:pict>
+          </mc:Fallback>
+        </mc:AlternateContent>
       </w:r>
     </w:p>
     <w:sectPr>
-      <w:pgSz w:w="12240" w:h="15840"/>
-      <w:pgMar w:top="1417" w:right="1701" w:bottom="1417" w:left="1701" w:header="708" w:footer="708" w:gutter="0"/>
+      <w:pgSz w:w="15840" w:h="12240" w:orient="landscape"/>
+      <w:pgMar w:top="1701" w:right="1417" w:bottom="1701" w:left="1417" w:header="708" w:footer="708" w:gutter="0"/>
       <w:cols w:space="708"/>
       <w:docGrid w:linePitch="360"/>
     </w:sectPr>

</xml_diff>